<commit_message>
Revise Figure 1a four-target report with natural, rigorous Chinese academic prose, removing AI meta-commentary
</commit_message>
<xml_diff>
--- a/reports/图1a口径四目标RNA预测模型及外部盲测实验报告_20260929.docx
+++ b/reports/图1a口径四目标RNA预测模型及外部盲测实验报告_20260929.docx
@@ -4,7 +4,7 @@
   <w:body>
     <w:p>
       <w:pPr>
-        <w:spacing w:before="160" w:after="120" w:line="288" w:lineRule="auto"/>
+        <w:spacing w:before="120" w:after="80" w:line="288" w:lineRule="auto"/>
         <w:jc w:val="center"/>
       </w:pPr>
       <w:r>
@@ -12,16 +12,16 @@
           <w:rFonts w:ascii="Arial" w:hAnsi="Arial"/>
           <w:b/>
           <w:i w:val="0"/>
-          <w:color w:val="1E2D46"/>
+          <w:color w:val="141E32"/>
           <w:sz w:val="32"/>
           <w:rFonts w:ascii="Arial" w:hAnsi="Arial" w:eastAsia="SimHei"/>
         </w:rPr>
-        <w:t>RNA 表达预测组学内 DDR 与 DNA 修复蛋白占比模型及外部验证实验报告</w:t>
+        <w:t>RNA 表达预测组学内 DDR 与 DNA 修复蛋白占比模型分析报告</w:t>
       </w:r>
     </w:p>
     <w:p>
       <w:pPr>
-        <w:spacing w:before="0" w:after="280"/>
+        <w:spacing w:before="0" w:after="240"/>
         <w:jc w:val="center"/>
       </w:pPr>
       <w:r>
@@ -33,7 +33,7 @@
           <w:sz w:val="21"/>
           <w:rFonts w:ascii="Arial" w:hAnsi="Arial" w:eastAsia="SimSun"/>
         </w:rPr>
-        <w:t>图 1a 计数口径重构、四目标非线性建模与独立队列盲测实证</w:t>
+        <w:t>图 1a 计数口径下的四目标非线性建模与独立队列材料级对照验证</w:t>
       </w:r>
     </w:p>
     <w:tbl>
@@ -57,7 +57,7 @@
       <w:tr>
         <w:tc>
           <w:tcPr>
-            <w:tcW w:type="dxa" w:w="1928"/>
+            <w:tcW w:type="dxa" w:w="1814"/>
           </w:tcPr>
           <w:p>
             <w:pPr>
@@ -69,17 +69,17 @@
                 <w:rFonts w:ascii="Arial" w:hAnsi="Arial"/>
                 <w:b/>
                 <w:i w:val="0"/>
-                <w:color w:val="505050"/>
+                <w:color w:val="464646"/>
                 <w:sz w:val="19"/>
                 <w:rFonts w:ascii="Arial" w:hAnsi="Arial" w:eastAsia="SimHei"/>
               </w:rPr>
-              <w:t>项目课题：</w:t>
+              <w:t>研究课题：</w:t>
             </w:r>
           </w:p>
         </w:tc>
         <w:tc>
           <w:tcPr>
-            <w:tcW w:type="dxa" w:w="7143"/>
+            <w:tcW w:type="dxa" w:w="7257"/>
           </w:tcPr>
           <w:p>
             <w:pPr>
@@ -91,7 +91,7 @@
                 <w:rFonts w:ascii="Arial" w:hAnsi="Arial"/>
                 <w:b w:val="0"/>
                 <w:i w:val="0"/>
-                <w:color w:val="323232"/>
+                <w:color w:val="282828"/>
                 <w:sz w:val="19"/>
                 <w:rFonts w:ascii="Arial" w:hAnsi="Arial" w:eastAsia="SimSun"/>
               </w:rPr>
@@ -103,7 +103,7 @@
       <w:tr>
         <w:tc>
           <w:tcPr>
-            <w:tcW w:type="dxa" w:w="1928"/>
+            <w:tcW w:type="dxa" w:w="1814"/>
           </w:tcPr>
           <w:p>
             <w:pPr>
@@ -115,17 +115,17 @@
                 <w:rFonts w:ascii="Arial" w:hAnsi="Arial"/>
                 <w:b/>
                 <w:i w:val="0"/>
-                <w:color w:val="505050"/>
+                <w:color w:val="464646"/>
                 <w:sz w:val="19"/>
                 <w:rFonts w:ascii="Arial" w:hAnsi="Arial" w:eastAsia="SimHei"/>
               </w:rPr>
-              <w:t>最新预测目标：</w:t>
+              <w:t>预测目标：</w:t>
             </w:r>
           </w:p>
         </w:tc>
         <w:tc>
           <w:tcPr>
-            <w:tcW w:type="dxa" w:w="7143"/>
+            <w:tcW w:type="dxa" w:w="7257"/>
           </w:tcPr>
           <w:p>
             <w:pPr>
@@ -137,11 +137,11 @@
                 <w:rFonts w:ascii="Arial" w:hAnsi="Arial"/>
                 <w:b w:val="0"/>
                 <w:i w:val="0"/>
-                <w:color w:val="323232"/>
+                <w:color w:val="282828"/>
                 <w:sz w:val="19"/>
                 <w:rFonts w:ascii="Arial" w:hAnsi="Arial" w:eastAsia="SimSun"/>
               </w:rPr>
-              <w:t>组学内部构成比 (普通组/Kla 组内的 DDR 与 DNA repair 蛋白检出占比)</w:t>
+              <w:t>组学内部构成比 (普通蛋白组与 Kla 蛋白组各自内部的 DDR / DNA repair 检出占比)</w:t>
             </w:r>
           </w:p>
         </w:tc>
@@ -149,7 +149,7 @@
       <w:tr>
         <w:tc>
           <w:tcPr>
-            <w:tcW w:type="dxa" w:w="1928"/>
+            <w:tcW w:type="dxa" w:w="1814"/>
           </w:tcPr>
           <w:p>
             <w:pPr>
@@ -161,7 +161,7 @@
                 <w:rFonts w:ascii="Arial" w:hAnsi="Arial"/>
                 <w:b/>
                 <w:i w:val="0"/>
-                <w:color w:val="505050"/>
+                <w:color w:val="464646"/>
                 <w:sz w:val="19"/>
                 <w:rFonts w:ascii="Arial" w:hAnsi="Arial" w:eastAsia="SimHei"/>
               </w:rPr>
@@ -171,7 +171,7 @@
         </w:tc>
         <w:tc>
           <w:tcPr>
-            <w:tcW w:type="dxa" w:w="7143"/>
+            <w:tcW w:type="dxa" w:w="7257"/>
           </w:tcPr>
           <w:p>
             <w:pPr>
@@ -183,11 +183,11 @@
                 <w:rFonts w:ascii="Arial" w:hAnsi="Arial"/>
                 <w:b w:val="0"/>
                 <w:i w:val="0"/>
-                <w:color w:val="323232"/>
+                <w:color w:val="282828"/>
                 <w:sz w:val="19"/>
                 <w:rFonts w:ascii="Arial" w:hAnsi="Arial" w:eastAsia="SimSun"/>
               </w:rPr>
-              <w:t>完全对齐论文图 1a 定义 (分子与分母同属单一组学，不求跨组学交集)</w:t>
+              <w:t>严格对齐论文图 1a 定义 (分子与分母同属单一组学，不求跨组学交集)</w:t>
             </w:r>
           </w:p>
         </w:tc>
@@ -195,7 +195,7 @@
       <w:tr>
         <w:tc>
           <w:tcPr>
-            <w:tcW w:type="dxa" w:w="1928"/>
+            <w:tcW w:type="dxa" w:w="1814"/>
           </w:tcPr>
           <w:p>
             <w:pPr>
@@ -207,17 +207,17 @@
                 <w:rFonts w:ascii="Arial" w:hAnsi="Arial"/>
                 <w:b/>
                 <w:i w:val="0"/>
-                <w:color w:val="505050"/>
+                <w:color w:val="464646"/>
                 <w:sz w:val="19"/>
                 <w:rFonts w:ascii="Arial" w:hAnsi="Arial" w:eastAsia="SimHei"/>
               </w:rPr>
-              <w:t>特征输入：</w:t>
+              <w:t>输入特征：</w:t>
             </w:r>
           </w:p>
         </w:tc>
         <w:tc>
           <w:tcPr>
-            <w:tcW w:type="dxa" w:w="7143"/>
+            <w:tcW w:type="dxa" w:w="7257"/>
           </w:tcPr>
           <w:p>
             <w:pPr>
@@ -229,11 +229,11 @@
                 <w:rFonts w:ascii="Arial" w:hAnsi="Arial"/>
                 <w:b w:val="0"/>
                 <w:i w:val="0"/>
-                <w:color w:val="323232"/>
+                <w:color w:val="282828"/>
                 <w:sz w:val="19"/>
                 <w:rFonts w:ascii="Arial" w:hAnsi="Arial" w:eastAsia="SimSun"/>
               </w:rPr>
-              <w:t>全转录组 18,332 个共有 Ensembl 稳定基因 (log2(TPM + 0.5) 尺度)</w:t>
+              <w:t>全转录组 18,332 个共有 Ensembl 稳定基因 (log2(TPM + 0.5) 表达矩阵)</w:t>
             </w:r>
           </w:p>
         </w:tc>
@@ -241,7 +241,7 @@
       <w:tr>
         <w:tc>
           <w:tcPr>
-            <w:tcW w:type="dxa" w:w="1928"/>
+            <w:tcW w:type="dxa" w:w="1814"/>
           </w:tcPr>
           <w:p>
             <w:pPr>
@@ -253,17 +253,17 @@
                 <w:rFonts w:ascii="Arial" w:hAnsi="Arial"/>
                 <w:b/>
                 <w:i w:val="0"/>
-                <w:color w:val="505050"/>
+                <w:color w:val="464646"/>
                 <w:sz w:val="19"/>
                 <w:rFonts w:ascii="Arial" w:hAnsi="Arial" w:eastAsia="SimHei"/>
               </w:rPr>
-              <w:t>训练/内部测试：</w:t>
+              <w:t>内部验证设计：</w:t>
             </w:r>
           </w:p>
         </w:tc>
         <w:tc>
           <w:tcPr>
-            <w:tcW w:type="dxa" w:w="7143"/>
+            <w:tcW w:type="dxa" w:w="7257"/>
           </w:tcPr>
           <w:p>
             <w:pPr>
@@ -275,11 +275,11 @@
                 <w:rFonts w:ascii="Arial" w:hAnsi="Arial"/>
                 <w:b w:val="0"/>
                 <w:i w:val="0"/>
-                <w:color w:val="323232"/>
+                <w:color w:val="282828"/>
                 <w:sz w:val="19"/>
                 <w:rFonts w:ascii="Arial" w:hAnsi="Arial" w:eastAsia="SimSun"/>
               </w:rPr>
-              <w:t>1,898 条 RNA (1,524 训练 / 374 内部留出，供者感知隔离)</w:t>
+              <w:t>1,898 条 RNA (1,524 训练 / 374 内部留出，供者隔离，种子 25)</w:t>
             </w:r>
           </w:p>
         </w:tc>
@@ -287,7 +287,7 @@
       <w:tr>
         <w:tc>
           <w:tcPr>
-            <w:tcW w:type="dxa" w:w="1928"/>
+            <w:tcW w:type="dxa" w:w="1814"/>
           </w:tcPr>
           <w:p>
             <w:pPr>
@@ -299,17 +299,17 @@
                 <w:rFonts w:ascii="Arial" w:hAnsi="Arial"/>
                 <w:b/>
                 <w:i w:val="0"/>
-                <w:color w:val="505050"/>
+                <w:color w:val="464646"/>
                 <w:sz w:val="19"/>
                 <w:rFonts w:ascii="Arial" w:hAnsi="Arial" w:eastAsia="SimHei"/>
               </w:rPr>
-              <w:t>外部盲测队列：</w:t>
+              <w:t>外部对照队列：</w:t>
             </w:r>
           </w:p>
         </w:tc>
         <w:tc>
           <w:tcPr>
-            <w:tcW w:type="dxa" w:w="7143"/>
+            <w:tcW w:type="dxa" w:w="7257"/>
           </w:tcPr>
           <w:p>
             <w:pPr>
@@ -321,11 +321,11 @@
                 <w:rFonts w:ascii="Arial" w:hAnsi="Arial"/>
                 <w:b w:val="0"/>
                 <w:i w:val="0"/>
-                <w:color w:val="323232"/>
+                <w:color w:val="282828"/>
                 <w:sz w:val="19"/>
                 <w:rFonts w:ascii="Arial" w:hAnsi="Arial" w:eastAsia="SimSun"/>
               </w:rPr>
-              <w:t>PXD063945 (华山医院 ESCC 质谱) + GSE130078 (韩国 46 例配对组织 RNA)</w:t>
+              <w:t>质谱: PXD063945 (华山医院 ESCC)；RNA: GSE130078 (韩国 YSH 队列 46 例配对组织)</w:t>
             </w:r>
           </w:p>
         </w:tc>
@@ -333,7 +333,7 @@
       <w:tr>
         <w:tc>
           <w:tcPr>
-            <w:tcW w:type="dxa" w:w="1928"/>
+            <w:tcW w:type="dxa" w:w="1814"/>
           </w:tcPr>
           <w:p>
             <w:pPr>
@@ -345,7 +345,7 @@
                 <w:rFonts w:ascii="Arial" w:hAnsi="Arial"/>
                 <w:b/>
                 <w:i w:val="0"/>
-                <w:color w:val="505050"/>
+                <w:color w:val="464646"/>
                 <w:sz w:val="19"/>
                 <w:rFonts w:ascii="Arial" w:hAnsi="Arial" w:eastAsia="SimHei"/>
               </w:rPr>
@@ -355,7 +355,7 @@
         </w:tc>
         <w:tc>
           <w:tcPr>
-            <w:tcW w:type="dxa" w:w="7143"/>
+            <w:tcW w:type="dxa" w:w="7257"/>
           </w:tcPr>
           <w:p>
             <w:pPr>
@@ -367,11 +367,11 @@
                 <w:rFonts w:ascii="Arial" w:hAnsi="Arial"/>
                 <w:b w:val="0"/>
                 <w:i w:val="0"/>
-                <w:color w:val="323232"/>
+                <w:color w:val="282828"/>
                 <w:sz w:val="19"/>
                 <w:rFonts w:ascii="Arial" w:hAnsi="Arial" w:eastAsia="SimSun"/>
               </w:rPr>
-              <w:t>2026 年 9 月 29 日</w:t>
+              <w:t>2026 年 9 月 30 日</w:t>
             </w:r>
           </w:p>
         </w:tc>
@@ -379,24 +379,24 @@
     </w:tbl>
     <w:p>
       <w:pPr>
-        <w:spacing w:before="0" w:after="160"/>
+        <w:spacing w:before="0" w:after="120"/>
       </w:pPr>
     </w:p>
     <w:p>
       <w:pPr>
         <w:keepNext/>
-        <w:spacing w:before="280" w:after="120"/>
+        <w:spacing w:before="280" w:after="100"/>
       </w:pPr>
       <w:r>
         <w:rPr>
           <w:rFonts w:ascii="Arial" w:hAnsi="Arial"/>
           <w:b/>
           <w:i w:val="0"/>
-          <w:color w:val="1F4E79"/>
-          <w:sz w:val="27"/>
+          <w:color w:val="19375F"/>
+          <w:sz w:val="26"/>
           <w:rFonts w:ascii="Arial" w:hAnsi="Arial" w:eastAsia="SimHei"/>
         </w:rPr>
-        <w:t>一、核心进展与结论摘要 (Executive Summary)</w:t>
+        <w:t>一、研究背景与主要结论</w:t>
       </w:r>
     </w:p>
     <w:p>
@@ -409,10 +409,42 @@
           <w:rFonts w:ascii="Arial" w:hAnsi="Arial"/>
           <w:b w:val="0"/>
           <w:i w:val="0"/>
-          <w:sz w:val="22"/>
+          <w:sz w:val="21"/>
           <w:rFonts w:ascii="Arial" w:hAnsi="Arial" w:eastAsia="SimSun"/>
         </w:rPr>
-        <w:t>根据导师对模型预测目标的根本性更正，本轮建模放弃了此前‘跨组学求交集比值（Kla ∩ Proteome / Proteome）’的旧框架，彻底切换至与论文图 1a 完全一致的【组学内部组成比例（Within-Assay Composition）】口径。针对普通蛋白质组与乳酸化修饰组，分别独立训练四个高精度回归森林模型：</w:t>
+        <w:t>在前期探索中，预测目标曾被设定为‘普通蛋白组检出的通路蛋白中同时发生乳酸化的比例’。然而，该跨组学交集比值的分子依赖抗体富集质谱、分母依赖常规全蛋白组质谱，受制于两套实验检测深度的交乘影响，在跨实验室验证时容易出现系统性基线偏移，且与论文图 1a 的统计口径存在出入。</w:t>
+      </w:r>
+    </w:p>
+    <w:p>
+      <w:pPr>
+        <w:spacing w:line="300" w:lineRule="auto" w:before="0" w:after="60"/>
+        <w:ind w:firstLine="420"/>
+      </w:pPr>
+      <w:r>
+        <w:rPr>
+          <w:rFonts w:ascii="Arial" w:hAnsi="Arial"/>
+          <w:b w:val="0"/>
+          <w:i w:val="0"/>
+          <w:sz w:val="21"/>
+          <w:rFonts w:ascii="Arial" w:hAnsi="Arial" w:eastAsia="SimSun"/>
+        </w:rPr>
+        <w:t>为此，本轮分析将预测目标调整为与论文图 1a 完全一致的【组学内部组成比例（Within-Assay Composition）】：分别在普通蛋白质组和乳酸化修饰组内部，计算 DDR 及 DNA 修复相关蛋白占各自总检出蛋白的百分比。四个目标各自独立训练随机森林回归模型，输入特征保持为全转录组 18,332 个共有 Ensembl 基因。</w:t>
+      </w:r>
+    </w:p>
+    <w:p>
+      <w:pPr>
+        <w:spacing w:line="300" w:lineRule="auto" w:before="0" w:after="60"/>
+        <w:ind w:firstLine="420"/>
+      </w:pPr>
+      <w:r>
+        <w:rPr>
+          <w:rFonts w:ascii="Arial" w:hAnsi="Arial"/>
+          <w:b w:val="0"/>
+          <w:i w:val="0"/>
+          <w:sz w:val="21"/>
+          <w:rFonts w:ascii="Arial" w:hAnsi="Arial" w:eastAsia="SimSun"/>
+        </w:rPr>
+        <w:t>四个预测目标的定义如下：</w:t>
       </w:r>
     </w:p>
     <w:p>
@@ -439,7 +471,7 @@
           <w:sz w:val="21"/>
           <w:rFonts w:ascii="Arial" w:hAnsi="Arial" w:eastAsia="SimSun"/>
         </w:rPr>
-        <w:t>目标 1：</w:t>
+        <w:t xml:space="preserve">1. </w:t>
       </w:r>
       <w:r>
         <w:rPr>
@@ -449,7 +481,7 @@
           <w:sz w:val="21"/>
           <w:rFonts w:ascii="Arial" w:hAnsi="Arial" w:eastAsia="SimSun"/>
         </w:rPr>
-        <w:t>普通组 DDR 占比 (Proteome_DDR)：普通蛋白组中 DDR 检出蛋白数 / 全部普通组蛋白数 × 100；</w:t>
+        <w:t>普通组 DDR 占比 (Proteome_DDR)：普通蛋白组中 DDR 检出蛋白数 / 全部普通组检出蛋白数 × 100；</w:t>
       </w:r>
     </w:p>
     <w:p>
@@ -476,7 +508,7 @@
           <w:sz w:val="21"/>
           <w:rFonts w:ascii="Arial" w:hAnsi="Arial" w:eastAsia="SimSun"/>
         </w:rPr>
-        <w:t>目标 2：</w:t>
+        <w:t xml:space="preserve">2. </w:t>
       </w:r>
       <w:r>
         <w:rPr>
@@ -486,7 +518,7 @@
           <w:sz w:val="21"/>
           <w:rFonts w:ascii="Arial" w:hAnsi="Arial" w:eastAsia="SimSun"/>
         </w:rPr>
-        <w:t>Kla 组 DDR 占比 (Kla_DDR)：Kla 蛋白组中 DDR 检出蛋白数 / 全部 Kla 组蛋白数 × 100；</w:t>
+        <w:t>Kla 组 DDR 占比 (Kla_DDR)：Kla 蛋白组中 DDR 检出蛋白数 / 全部 Kla 组检出蛋白数 × 100；</w:t>
       </w:r>
     </w:p>
     <w:p>
@@ -513,7 +545,7 @@
           <w:sz w:val="21"/>
           <w:rFonts w:ascii="Arial" w:hAnsi="Arial" w:eastAsia="SimSun"/>
         </w:rPr>
-        <w:t>目标 3：</w:t>
+        <w:t xml:space="preserve">3. </w:t>
       </w:r>
       <w:r>
         <w:rPr>
@@ -523,7 +555,7 @@
           <w:sz w:val="21"/>
           <w:rFonts w:ascii="Arial" w:hAnsi="Arial" w:eastAsia="SimSun"/>
         </w:rPr>
-        <w:t>普通组 DNA repair 占比 (Proteome_DNA_repair)：普通蛋白组中修复蛋白数 / 全部普通组蛋白数 × 100；</w:t>
+        <w:t>普通组 DNA repair 占比 (Proteome_DNA_repair)：普通蛋白组中 DNA 修复蛋白数 / 全部普通组检出蛋白数 × 100；</w:t>
       </w:r>
     </w:p>
     <w:p>
@@ -550,7 +582,7 @@
           <w:sz w:val="21"/>
           <w:rFonts w:ascii="Arial" w:hAnsi="Arial" w:eastAsia="SimSun"/>
         </w:rPr>
-        <w:t>目标 4：</w:t>
+        <w:t xml:space="preserve">4. </w:t>
       </w:r>
       <w:r>
         <w:rPr>
@@ -560,7 +592,7 @@
           <w:sz w:val="21"/>
           <w:rFonts w:ascii="Arial" w:hAnsi="Arial" w:eastAsia="SimSun"/>
         </w:rPr>
-        <w:t>Kla 组 DNA repair 占比 (Kla_DNA_repair)：Kla 蛋白组中修复蛋白数 / 全部 Kla 组蛋白数 × 100。</w:t>
+        <w:t>Kla 组 DNA repair 占比 (Kla_DNA_repair)：Kla 蛋白组中 DNA 修复蛋白数 / 全部 Kla 组检出蛋白数 × 100。</w:t>
       </w:r>
     </w:p>
     <w:p>
@@ -573,20 +605,168 @@
           <w:rFonts w:ascii="Arial" w:hAnsi="Arial"/>
           <w:b/>
           <w:i w:val="0"/>
-          <w:sz w:val="22"/>
+          <w:sz w:val="21"/>
           <w:rFonts w:ascii="Arial" w:hAnsi="Arial" w:eastAsia="SimSun"/>
         </w:rPr>
-        <w:t>重大突破：</w:t>
+        <w:t>主要结论概括：</w:t>
       </w:r>
       <w:r>
         <w:rPr>
           <w:rFonts w:ascii="Arial" w:hAnsi="Arial"/>
           <w:b w:val="0"/>
           <w:i w:val="0"/>
-          <w:sz w:val="22"/>
+          <w:sz w:val="21"/>
           <w:rFonts w:ascii="Arial" w:hAnsi="Arial" w:eastAsia="SimSun"/>
         </w:rPr>
-        <w:t>核心结论：组学内部组成比例反映的是组织细胞内在的基础蛋白质稳态构成，成功消除了此前两套质谱检测深度交乘导致的跨实验室系统性基线漂移！在完全冻结模型的真实外部独立盲测中（GSE130078 新 RNA vs PXD063945 新质谱），肿瘤组织中四个目标的盲测平均绝对误差全部降至 0.05 ~ 0.19 个百分点，且 100% 的盲测样本误差均在 ±1 个百分点以内，显著超越无 RNA 基线！</w:t>
+        <w:t>核心评估结果表明：</w:t>
+      </w:r>
+    </w:p>
+    <w:p>
+      <w:pPr>
+        <w:spacing w:line="300" w:lineRule="auto" w:before="20" w:after="40"/>
+        <w:ind w:left="420" w:hanging="227"/>
+      </w:pPr>
+      <w:r>
+        <w:rPr>
+          <w:rFonts w:ascii="Arial" w:hAnsi="Arial"/>
+          <w:b/>
+          <w:i w:val="0"/>
+          <w:color w:val="1F4E79"/>
+          <w:sz w:val="19"/>
+          <w:rFonts w:ascii="Arial" w:hAnsi="Arial" w:eastAsia="SimSun"/>
+        </w:rPr>
+        <w:t xml:space="preserve">▪ </w:t>
+      </w:r>
+      <w:r>
+        <w:rPr>
+          <w:rFonts w:ascii="Arial" w:hAnsi="Arial"/>
+          <w:b/>
+          <w:i w:val="0"/>
+          <w:sz w:val="21"/>
+          <w:rFonts w:ascii="Arial" w:hAnsi="Arial" w:eastAsia="SimSun"/>
+        </w:rPr>
+        <w:t>内部留出一致性高：</w:t>
+      </w:r>
+      <w:r>
+        <w:rPr>
+          <w:rFonts w:ascii="Arial" w:hAnsi="Arial"/>
+          <w:b w:val="0"/>
+          <w:i w:val="0"/>
+          <w:sz w:val="21"/>
+          <w:rFonts w:ascii="Arial" w:hAnsi="Arial" w:eastAsia="SimSun"/>
+        </w:rPr>
+        <w:t>内部留出表现优异：在 374 条未参与训练的同类材料 RNA 记录中，四个目标的逐记录 MAE 均在 0.03～0.20 个百分点，R² 为 0.94～0.98，超过 96% 的记录误差在 ±1 个百分点以内；</w:t>
+      </w:r>
+    </w:p>
+    <w:p>
+      <w:pPr>
+        <w:spacing w:line="300" w:lineRule="auto" w:before="20" w:after="40"/>
+        <w:ind w:left="420" w:hanging="227"/>
+      </w:pPr>
+      <w:r>
+        <w:rPr>
+          <w:rFonts w:ascii="Arial" w:hAnsi="Arial"/>
+          <w:b/>
+          <w:i w:val="0"/>
+          <w:color w:val="1F4E79"/>
+          <w:sz w:val="19"/>
+          <w:rFonts w:ascii="Arial" w:hAnsi="Arial" w:eastAsia="SimSun"/>
+        </w:rPr>
+        <w:t xml:space="preserve">▪ </w:t>
+      </w:r>
+      <w:r>
+        <w:rPr>
+          <w:rFonts w:ascii="Arial" w:hAnsi="Arial"/>
+          <w:b/>
+          <w:i w:val="0"/>
+          <w:sz w:val="21"/>
+          <w:rFonts w:ascii="Arial" w:hAnsi="Arial" w:eastAsia="SimSun"/>
+        </w:rPr>
+        <w:t>外部肿瘤组织验证良好：</w:t>
+      </w:r>
+      <w:r>
+        <w:rPr>
+          <w:rFonts w:ascii="Arial" w:hAnsi="Arial"/>
+          <w:b w:val="0"/>
+          <w:i w:val="0"/>
+          <w:sz w:val="21"/>
+          <w:rFonts w:ascii="Arial" w:hAnsi="Arial" w:eastAsia="SimSun"/>
+        </w:rPr>
+        <w:t>外部肿瘤材料对照高度吻合：在外部独立的食管鳞癌未治疗肿瘤组织中，四个目标的平均预测值与新质谱真值的偏差均在 0.05～0.19 个百分点，显著优于无 RNA 基线；</w:t>
+      </w:r>
+    </w:p>
+    <w:p>
+      <w:pPr>
+        <w:spacing w:line="300" w:lineRule="auto" w:before="20" w:after="40"/>
+        <w:ind w:left="420" w:hanging="227"/>
+      </w:pPr>
+      <w:r>
+        <w:rPr>
+          <w:rFonts w:ascii="Arial" w:hAnsi="Arial"/>
+          <w:b/>
+          <w:i w:val="0"/>
+          <w:color w:val="1F4E79"/>
+          <w:sz w:val="19"/>
+          <w:rFonts w:ascii="Arial" w:hAnsi="Arial" w:eastAsia="SimSun"/>
+        </w:rPr>
+        <w:t xml:space="preserve">▪ </w:t>
+      </w:r>
+      <w:r>
+        <w:rPr>
+          <w:rFonts w:ascii="Arial" w:hAnsi="Arial"/>
+          <w:b/>
+          <w:i w:val="0"/>
+          <w:sz w:val="21"/>
+          <w:rFonts w:ascii="Arial" w:hAnsi="Arial" w:eastAsia="SimSun"/>
+        </w:rPr>
+        <w:t>组织类型差异客观存在：</w:t>
+      </w:r>
+      <w:r>
+        <w:rPr>
+          <w:rFonts w:ascii="Arial" w:hAnsi="Arial"/>
+          <w:b w:val="0"/>
+          <w:i w:val="0"/>
+          <w:sz w:val="21"/>
+          <w:rFonts w:ascii="Arial" w:hAnsi="Arial" w:eastAsia="SimSun"/>
+        </w:rPr>
+        <w:t>外部癌旁预测存在一定偏离：在外部配对癌旁切片中，Kla 组的预测误差为 1.0～1.8 个百分点，反映出癌旁正常组织的修饰基线与模型在肿瘤中学习到的规律存在一定差异；</w:t>
+      </w:r>
+    </w:p>
+    <w:p>
+      <w:pPr>
+        <w:spacing w:line="300" w:lineRule="auto" w:before="20" w:after="40"/>
+        <w:ind w:left="420" w:hanging="227"/>
+      </w:pPr>
+      <w:r>
+        <w:rPr>
+          <w:rFonts w:ascii="Arial" w:hAnsi="Arial"/>
+          <w:b/>
+          <w:i w:val="0"/>
+          <w:color w:val="1F4E79"/>
+          <w:sz w:val="19"/>
+          <w:rFonts w:ascii="Arial" w:hAnsi="Arial" w:eastAsia="SimSun"/>
+        </w:rPr>
+        <w:t xml:space="preserve">▪ </w:t>
+      </w:r>
+      <w:r>
+        <w:rPr>
+          <w:rFonts w:ascii="Arial" w:hAnsi="Arial"/>
+          <w:b/>
+          <w:i w:val="0"/>
+          <w:sz w:val="21"/>
+          <w:rFonts w:ascii="Arial" w:hAnsi="Arial" w:eastAsia="SimSun"/>
+        </w:rPr>
+        <w:t>适用边界明确：</w:t>
+      </w:r>
+      <w:r>
+        <w:rPr>
+          <w:rFonts w:ascii="Arial" w:hAnsi="Arial"/>
+          <w:b w:val="0"/>
+          <w:i w:val="0"/>
+          <w:sz w:val="21"/>
+          <w:rFonts w:ascii="Arial" w:hAnsi="Arial" w:eastAsia="SimSun"/>
+        </w:rPr>
+        <w:t>模型定位于组织水平参考重现：每条 RNA 记录对应的是所属材料的质谱共享参考标签，当前结果支持在材料层面重现通路占比，尚不能证明可用于单人水平的个体差异预测。</w:t>
       </w:r>
     </w:p>
     <w:p>
@@ -601,11 +781,11 @@
           <w:rFonts w:ascii="Arial" w:hAnsi="Arial"/>
           <w:b/>
           <w:i w:val="0"/>
-          <w:color w:val="3C3C3C"/>
+          <w:color w:val="323232"/>
           <w:sz w:val="20"/>
           <w:rFonts w:ascii="Arial" w:hAnsi="Arial" w:eastAsia="SimSun"/>
         </w:rPr>
-        <w:t>表 1 四大组学内部通路占比模型在训练、内部验证与来源留出下的性能指标总表</w:t>
+        <w:t>表 1 四大组学内部通路占比模型在不同验证阶段的性能指标汇总表</w:t>
       </w:r>
     </w:p>
     <w:tbl>
@@ -642,7 +822,7 @@
             <w:tcBorders>
               <w:bottom w:val="single" w:sz="6" w:space="0" w:color="000000"/>
             </w:tcBorders>
-            <w:shd w:val="clear" w:color="auto" w:fill="F2F5F8"/>
+            <w:shd w:val="clear" w:color="auto" w:fill="F5F7FA"/>
           </w:tcPr>
           <w:p>
             <w:pPr>
@@ -668,7 +848,7 @@
             <w:tcBorders>
               <w:bottom w:val="single" w:sz="6" w:space="0" w:color="000000"/>
             </w:tcBorders>
-            <w:shd w:val="clear" w:color="auto" w:fill="F2F5F8"/>
+            <w:shd w:val="clear" w:color="auto" w:fill="F5F7FA"/>
           </w:tcPr>
           <w:p>
             <w:pPr>
@@ -694,7 +874,7 @@
             <w:tcBorders>
               <w:bottom w:val="single" w:sz="6" w:space="0" w:color="000000"/>
             </w:tcBorders>
-            <w:shd w:val="clear" w:color="auto" w:fill="F2F5F8"/>
+            <w:shd w:val="clear" w:color="auto" w:fill="F5F7FA"/>
           </w:tcPr>
           <w:p>
             <w:pPr>
@@ -720,7 +900,7 @@
             <w:tcBorders>
               <w:bottom w:val="single" w:sz="6" w:space="0" w:color="000000"/>
             </w:tcBorders>
-            <w:shd w:val="clear" w:color="auto" w:fill="F2F5F8"/>
+            <w:shd w:val="clear" w:color="auto" w:fill="F5F7FA"/>
           </w:tcPr>
           <w:p>
             <w:pPr>
@@ -746,7 +926,7 @@
             <w:tcBorders>
               <w:bottom w:val="single" w:sz="6" w:space="0" w:color="000000"/>
             </w:tcBorders>
-            <w:shd w:val="clear" w:color="auto" w:fill="F2F5F8"/>
+            <w:shd w:val="clear" w:color="auto" w:fill="F5F7FA"/>
           </w:tcPr>
           <w:p>
             <w:pPr>
@@ -772,7 +952,7 @@
             <w:tcBorders>
               <w:bottom w:val="single" w:sz="6" w:space="0" w:color="000000"/>
             </w:tcBorders>
-            <w:shd w:val="clear" w:color="auto" w:fill="F2F5F8"/>
+            <w:shd w:val="clear" w:color="auto" w:fill="F5F7FA"/>
           </w:tcPr>
           <w:p>
             <w:pPr>
@@ -798,7 +978,7 @@
             <w:tcBorders>
               <w:bottom w:val="single" w:sz="6" w:space="0" w:color="000000"/>
             </w:tcBorders>
-            <w:shd w:val="clear" w:color="auto" w:fill="F2F5F8"/>
+            <w:shd w:val="clear" w:color="auto" w:fill="F5F7FA"/>
           </w:tcPr>
           <w:p>
             <w:pPr>
@@ -824,7 +1004,7 @@
             <w:tcBorders>
               <w:bottom w:val="single" w:sz="6" w:space="0" w:color="000000"/>
             </w:tcBorders>
-            <w:shd w:val="clear" w:color="auto" w:fill="F2F5F8"/>
+            <w:shd w:val="clear" w:color="auto" w:fill="F5F7FA"/>
           </w:tcPr>
           <w:p>
             <w:pPr>
@@ -1566,32 +1746,32 @@
     <w:p>
       <w:pPr>
         <w:keepNext/>
-        <w:spacing w:before="280" w:after="120"/>
+        <w:spacing w:before="280" w:after="100"/>
       </w:pPr>
       <w:r>
         <w:rPr>
           <w:rFonts w:ascii="Arial" w:hAnsi="Arial"/>
           <w:b/>
           <w:i w:val="0"/>
-          <w:color w:val="1F4E79"/>
-          <w:sz w:val="27"/>
+          <w:color w:val="19375F"/>
+          <w:sz w:val="26"/>
           <w:rFonts w:ascii="Arial" w:hAnsi="Arial" w:eastAsia="SimHei"/>
         </w:rPr>
-        <w:t>二、数据架构与计数口径 (Methodology &amp; Definitions)</w:t>
+        <w:t>二、数据架构与计数口径</w:t>
       </w:r>
     </w:p>
     <w:p>
       <w:pPr>
         <w:keepNext/>
-        <w:spacing w:before="200" w:after="80"/>
+        <w:spacing w:before="180" w:after="60"/>
       </w:pPr>
       <w:r>
         <w:rPr>
           <w:rFonts w:ascii="Arial" w:hAnsi="Arial"/>
           <w:b/>
           <w:i w:val="0"/>
-          <w:color w:val="2C5A87"/>
-          <w:sz w:val="24"/>
+          <w:color w:val="284B78"/>
+          <w:sz w:val="23"/>
           <w:rFonts w:ascii="Arial" w:hAnsi="Arial" w:eastAsia="SimHei"/>
         </w:rPr>
         <w:t>2.1 图 1a 计数口径的严格复现</w:t>
@@ -1607,27 +1787,10 @@
           <w:rFonts w:ascii="Arial" w:hAnsi="Arial"/>
           <w:b w:val="0"/>
           <w:i w:val="0"/>
-          <w:sz w:val="22"/>
+          <w:sz w:val="21"/>
           <w:rFonts w:ascii="Arial" w:hAnsi="Arial" w:eastAsia="SimSun"/>
         </w:rPr>
-        <w:t>在既有数据体系中，普通蛋白组保留原始 SourceProteinID 计数单位（包括 Ensembl protein），一个源 ID 映射到多个 UniProt 时，任一映射命中目标 GO 集合即判定为命中，但源 ID 只计一次，完全复现冻结 group_summary_31.csv 中的基准数值。Kla 组统一按去重 BaseAccession 计数。所有分母均为单组学自身的检出总量，确保分子严格为分母的子集，数值天然在 0% ~ 100% 之间。</w:t>
-      </w:r>
-    </w:p>
-    <w:p>
-      <w:pPr>
-        <w:keepNext/>
-        <w:spacing w:before="200" w:after="80"/>
-      </w:pPr>
-      <w:r>
-        <w:rPr>
-          <w:rFonts w:ascii="Arial" w:hAnsi="Arial"/>
-          <w:b/>
-          <w:i w:val="0"/>
-          <w:color w:val="2C5A87"/>
-          <w:sz w:val="24"/>
-          <w:rFonts w:ascii="Arial" w:hAnsi="Arial" w:eastAsia="SimHei"/>
-        </w:rPr>
-        <w:t>2.2 建模算法与外部验证设计</w:t>
+        <w:t>在既有数据集的统计中，普通蛋白组保留原始 SourceProteinID 计数单位（包含部分 Ensembl protein），当一个源 ID 映射到多个 UniProt 时，任一映射命中目标 GO 集合即判定为命中，但源 ID 只计一次，以保证与冻结的 group_summary_31.csv 基准一致。Kla 组统一按去重 BaseAccession 计数。所有指标的分子均为分母的真子集，数值严格有界于 0%～100%。</w:t>
       </w:r>
     </w:p>
     <w:p>
@@ -1640,27 +1803,27 @@
           <w:rFonts w:ascii="Arial" w:hAnsi="Arial"/>
           <w:b w:val="0"/>
           <w:i w:val="0"/>
-          <w:sz w:val="22"/>
+          <w:sz w:val="21"/>
           <w:rFonts w:ascii="Arial" w:hAnsi="Arial" w:eastAsia="SimSun"/>
         </w:rPr>
-        <w:t>模型统一采用全转录组 18,332 个共有基因在 log2(TPM + 0.5) 尺度下的表达谱作为输入。采用供者感知的 1,524 训练 / 374 内部盲测切分，结合 14 折跨来源关联块留出验证。外部盲测采用华山医院 2026 年新发食管鳞癌未治疗切片质谱（PXD063945，普通组 25 列、Kla 组 22 列），输入韩国独立队列 46 例食管癌组织切片 RNA（GSE130078，23 例肿瘤 + 23 例癌旁），以完全冻结的模型直接进行盲测评估。</w:t>
+        <w:t>DDR 通路采用 GO:0006974 及其全部 is_a / part_of 后代定义（包含 2,660 个 UniProt BaseAccession）；DNA repair 采用 GO:0006281 及其后代定义（包含 2,135 个 UniProt BaseAccession）。GO 注释仅用于界定输出标签，不作为输入基因特征的筛选条件。</w:t>
       </w:r>
     </w:p>
     <w:p>
       <w:pPr>
         <w:keepNext/>
-        <w:spacing w:before="280" w:after="120"/>
+        <w:spacing w:before="180" w:after="60"/>
       </w:pPr>
       <w:r>
         <w:rPr>
           <w:rFonts w:ascii="Arial" w:hAnsi="Arial"/>
           <w:b/>
           <w:i w:val="0"/>
-          <w:color w:val="1F4E79"/>
-          <w:sz w:val="27"/>
+          <w:color w:val="284B78"/>
+          <w:sz w:val="23"/>
           <w:rFonts w:ascii="Arial" w:hAnsi="Arial" w:eastAsia="SimHei"/>
         </w:rPr>
-        <w:t>三、内部留出表现与跨来源验证 (Internal &amp; Source-heldout Results)</w:t>
+        <w:t>2.2 建模参数与样本划分</w:t>
       </w:r>
     </w:p>
     <w:p>
@@ -1673,16 +1836,65 @@
           <w:rFonts w:ascii="Arial" w:hAnsi="Arial"/>
           <w:b w:val="0"/>
           <w:i w:val="0"/>
-          <w:sz w:val="22"/>
+          <w:sz w:val="21"/>
           <w:rFonts w:ascii="Arial" w:hAnsi="Arial" w:eastAsia="SimSun"/>
         </w:rPr>
-        <w:t>图 1 展示了四个模型在 374 条独立内部测试样本上的预测表现；图 2 展示了 14 折整来源留出下的预测对照。</w:t>
+        <w:t>输入特征为各数据来源共有的全部 18,332 个 Ensembl 基因，统一采用修正后的 log2(TPM + 0.5) 尺度，不使用经验分位数平滑（qsmooth）。回归模型统一使用随机森林（ranger 包实现），设置 500 棵回归树，mtry = 135，最小叶节点大小为 1，随机种子固定为 25。样本权重综合平衡材料与供者数量，防止样本规模较大的组织主导特征分裂。</w:t>
+      </w:r>
+    </w:p>
+    <w:p>
+      <w:pPr>
+        <w:spacing w:line="300" w:lineRule="auto" w:before="0" w:after="60"/>
+        <w:ind w:firstLine="420"/>
+      </w:pPr>
+      <w:r>
+        <w:rPr>
+          <w:rFonts w:ascii="Arial" w:hAnsi="Arial"/>
+          <w:b w:val="0"/>
+          <w:i w:val="0"/>
+          <w:sz w:val="21"/>
+          <w:rFonts w:ascii="Arial" w:hAnsi="Arial" w:eastAsia="SimSun"/>
+        </w:rPr>
+        <w:t>验证方案分为两部分：一是供者隔离的内部留出验证（1,524 训练 / 374 留出，来自同一供者的样本不跨两侧）；二是 14 折跨来源关联块留出验证（每次留出一个来源块作为盲测，循环 14 次）。</w:t>
       </w:r>
     </w:p>
     <w:p>
       <w:pPr>
         <w:keepNext/>
-        <w:spacing w:before="160" w:after="40"/>
+        <w:spacing w:before="280" w:after="100"/>
+      </w:pPr>
+      <w:r>
+        <w:rPr>
+          <w:rFonts w:ascii="Arial" w:hAnsi="Arial"/>
+          <w:b/>
+          <w:i w:val="0"/>
+          <w:color w:val="19375F"/>
+          <w:sz w:val="26"/>
+          <w:rFonts w:ascii="Arial" w:hAnsi="Arial" w:eastAsia="SimHei"/>
+        </w:rPr>
+        <w:t>三、模型训练与内部留出结果</w:t>
+      </w:r>
+    </w:p>
+    <w:p>
+      <w:pPr>
+        <w:spacing w:line="300" w:lineRule="auto" w:before="0" w:after="60"/>
+        <w:ind w:firstLine="420"/>
+      </w:pPr>
+      <w:r>
+        <w:rPr>
+          <w:rFonts w:ascii="Arial" w:hAnsi="Arial"/>
+          <w:b w:val="0"/>
+          <w:i w:val="0"/>
+          <w:sz w:val="21"/>
+          <w:rFonts w:ascii="Arial" w:hAnsi="Arial" w:eastAsia="SimSun"/>
+        </w:rPr>
+        <w:t>图 1 展示了四个模型在 374 条独立内部测试样本上的预测散点分布；图 2 展示了 14 折来源留出下的表现。</w:t>
+      </w:r>
+    </w:p>
+    <w:p>
+      <w:pPr>
+        <w:keepNext/>
+        <w:spacing w:before="120" w:after="40"/>
         <w:ind w:firstLine="0"/>
         <w:jc w:val="center"/>
       </w:pPr>
@@ -1733,17 +1945,17 @@
           <w:rFonts w:ascii="Arial" w:hAnsi="Arial"/>
           <w:b/>
           <w:i w:val="0"/>
-          <w:color w:val="3C3C3C"/>
+          <w:color w:val="323232"/>
           <w:sz w:val="20"/>
           <w:rFonts w:ascii="Arial" w:hAnsi="Arial" w:eastAsia="SimSun"/>
         </w:rPr>
-        <w:t>图 1 四大组学内部通路占比模型在 374 条独立内部盲测样本上的预测表现散点图</w:t>
+        <w:t>图 1 四大组学内部通路占比模型在 374 条独立内部留出样本上的预测散点图</w:t>
       </w:r>
     </w:p>
     <w:p>
       <w:pPr>
         <w:keepNext/>
-        <w:spacing w:before="160" w:after="40"/>
+        <w:spacing w:before="120" w:after="40"/>
         <w:ind w:firstLine="0"/>
         <w:jc w:val="center"/>
       </w:pPr>
@@ -1794,11 +2006,11 @@
           <w:rFonts w:ascii="Arial" w:hAnsi="Arial"/>
           <w:b/>
           <w:i w:val="0"/>
-          <w:color w:val="3C3C3C"/>
+          <w:color w:val="323232"/>
           <w:sz w:val="20"/>
           <w:rFonts w:ascii="Arial" w:hAnsi="Arial" w:eastAsia="SimSun"/>
         </w:rPr>
-        <w:t>图 2 四大模型在 14 折整来源留出 (Leave-One-Source-Out) 交叉验证下的散点对照图</w:t>
+        <w:t>图 2 四大模型在 14 折来源关联块留出 (Leave-One-Source-Out) 下的预测对照图</w:t>
       </w:r>
     </w:p>
     <w:p>
@@ -1811,27 +2023,10 @@
           <w:rFonts w:ascii="Arial" w:hAnsi="Arial"/>
           <w:b w:val="0"/>
           <w:i w:val="0"/>
-          <w:sz w:val="22"/>
+          <w:sz w:val="21"/>
           <w:rFonts w:ascii="Arial" w:hAnsi="Arial" w:eastAsia="SimSun"/>
         </w:rPr>
-        <w:t>分析表明：在内部留出测试中，所有样本点紧贴对角虚线，逐记录 MAE 仅为 0.05 ~ 0.20 个百分点，R² 均在 0.94 ~ 0.98 之间，超过 96% ~ 100% 的盲测样本误差在 ±1 个百分点以内。在跨来源 14 折留出中，Kla 组的两个目标材料等权 MAE（DDR 1.61 pp, Repair 1.05 pp）均显著低于无 RNA 基线（3.33 pp 和 2.45 pp），误差缩减幅度达 51.7% ~ 57.1%，显示出明确的预测增益。</w:t>
-      </w:r>
-    </w:p>
-    <w:p>
-      <w:pPr>
-        <w:keepNext/>
-        <w:spacing w:before="280" w:after="120"/>
-      </w:pPr>
-      <w:r>
-        <w:rPr>
-          <w:rFonts w:ascii="Arial" w:hAnsi="Arial"/>
-          <w:b/>
-          <w:i w:val="0"/>
-          <w:color w:val="1F4E79"/>
-          <w:sz w:val="27"/>
-          <w:rFonts w:ascii="Arial" w:hAnsi="Arial" w:eastAsia="SimHei"/>
-        </w:rPr>
-        <w:t>四、首次外部独立数据盲测实证（食管鳞癌 ESCC）</w:t>
+        <w:t>结果显示：在内部留出测试中，所有样本点紧密贴近对角虚线（y = x），逐记录平均绝对误差在 0.03～0.20 个百分点之间，判定系数 R² 达到 0.94～0.98，表明模型在已见过的材料类型中能够极好地重现该材料对应的通路占比标签。</w:t>
       </w:r>
     </w:p>
     <w:p>
@@ -1844,16 +2039,65 @@
           <w:rFonts w:ascii="Arial" w:hAnsi="Arial"/>
           <w:b w:val="0"/>
           <w:i w:val="0"/>
-          <w:sz w:val="22"/>
+          <w:sz w:val="21"/>
           <w:rFonts w:ascii="Arial" w:hAnsi="Arial" w:eastAsia="SimSun"/>
         </w:rPr>
-        <w:t>图 3 展示了四个冻结模型在韩国新 RNA 队列（GSE130078）盲测华山医院质谱真值（PXD063945）的分布表现，详细指标汇总于表 2。</w:t>
+        <w:t>在跨来源关联块留出测试中，Kla 组的两个目标在材料等权口径下的 MAE 分别为 1.61 和 1.05 个百分点，均显著优于不使用 RNA 的简单中位数基线（3.33 和 2.45 个百分点），误差减少幅度为 51.7%～57.1%。这说明 RNA 表达特征即使在来源留出条件下也能提供一定的有效信息，但整体误差相较内部测试有所上升。</w:t>
       </w:r>
     </w:p>
     <w:p>
       <w:pPr>
         <w:keepNext/>
-        <w:spacing w:before="160" w:after="40"/>
+        <w:spacing w:before="280" w:after="100"/>
+      </w:pPr>
+      <w:r>
+        <w:rPr>
+          <w:rFonts w:ascii="Arial" w:hAnsi="Arial"/>
+          <w:b/>
+          <w:i w:val="0"/>
+          <w:color w:val="19375F"/>
+          <w:sz w:val="26"/>
+          <w:rFonts w:ascii="Arial" w:hAnsi="Arial" w:eastAsia="SimHei"/>
+        </w:rPr>
+        <w:t>四、外部独立队列的材料级对照验证</w:t>
+      </w:r>
+    </w:p>
+    <w:p>
+      <w:pPr>
+        <w:spacing w:line="300" w:lineRule="auto" w:before="0" w:after="60"/>
+        <w:ind w:firstLine="420"/>
+      </w:pPr>
+      <w:r>
+        <w:rPr>
+          <w:rFonts w:ascii="Arial" w:hAnsi="Arial"/>
+          <w:b w:val="0"/>
+          <w:i w:val="0"/>
+          <w:sz w:val="21"/>
+          <w:rFonts w:ascii="Arial" w:hAnsi="Arial" w:eastAsia="SimSun"/>
+        </w:rPr>
+        <w:t>为评估模型跨实验队列的泛化表现，我们检索并引入了 2026 年新公布的华山医院食管鳞癌蛋白质组与乳酸化组数据（PXD063945 / PMC13195773），以及韩国 YSH 队列 46 例配对食管癌切片组织 RNA 数据（GSE130078）。在完全冻结四个模型的前提下，直接输入外部 RNA 并与新质谱计算出的材料参考值进行比对。</w:t>
+      </w:r>
+    </w:p>
+    <w:p>
+      <w:pPr>
+        <w:spacing w:line="300" w:lineRule="auto" w:before="0" w:after="60"/>
+        <w:ind w:firstLine="420"/>
+      </w:pPr>
+      <w:r>
+        <w:rPr>
+          <w:rFonts w:ascii="Arial" w:hAnsi="Arial"/>
+          <w:b w:val="0"/>
+          <w:i w:val="0"/>
+          <w:sz w:val="21"/>
+          <w:rFonts w:ascii="Arial" w:hAnsi="Arial" w:eastAsia="SimSun"/>
+        </w:rPr>
+        <w:t>预测散点与分布如图 3 所示，具体数值详见表 2。</w:t>
+      </w:r>
+    </w:p>
+    <w:p>
+      <w:pPr>
+        <w:keepNext/>
+        <w:spacing w:before="120" w:after="40"/>
         <w:ind w:firstLine="0"/>
         <w:jc w:val="center"/>
       </w:pPr>
@@ -1904,11 +2148,11 @@
           <w:rFonts w:ascii="Arial" w:hAnsi="Arial"/>
           <w:b/>
           <w:i w:val="0"/>
-          <w:color w:val="3C3C3C"/>
+          <w:color w:val="323232"/>
           <w:sz w:val="20"/>
           <w:rFonts w:ascii="Arial" w:hAnsi="Arial" w:eastAsia="SimSun"/>
         </w:rPr>
-        <w:t>图 3 冻结模型在外部独立食管鳞癌队列 (GSE130078 组织 RNA vs PXD063945 质谱真值) 中的盲测分布图</w:t>
+        <w:t>图 3 冻结模型在外部独立食管鳞癌队列 (GSE130078 组织 RNA vs PXD063945 质谱参考值) 中的预测分布图</w:t>
       </w:r>
     </w:p>
     <w:p>
@@ -1923,11 +2167,11 @@
           <w:rFonts w:ascii="Arial" w:hAnsi="Arial"/>
           <w:b/>
           <w:i w:val="0"/>
-          <w:color w:val="3C3C3C"/>
+          <w:color w:val="323232"/>
           <w:sz w:val="20"/>
           <w:rFonts w:ascii="Arial" w:hAnsi="Arial" w:eastAsia="SimSun"/>
         </w:rPr>
-        <w:t>表 2 外部独立队列 (GSE130078 组织 RNA vs PXD063945 质谱真值) 四目标盲测性能统计表</w:t>
+        <w:t>表 2 外部独立队列 (GSE130078 组织 RNA vs PXD063945 质谱参考值) 性能对照表</w:t>
       </w:r>
     </w:p>
     <w:tbl>
@@ -1963,7 +2207,7 @@
             <w:tcBorders>
               <w:bottom w:val="single" w:sz="6" w:space="0" w:color="000000"/>
             </w:tcBorders>
-            <w:shd w:val="clear" w:color="auto" w:fill="F2F5F8"/>
+            <w:shd w:val="clear" w:color="auto" w:fill="F5F7FA"/>
           </w:tcPr>
           <w:p>
             <w:pPr>
@@ -1989,7 +2233,7 @@
             <w:tcBorders>
               <w:bottom w:val="single" w:sz="6" w:space="0" w:color="000000"/>
             </w:tcBorders>
-            <w:shd w:val="clear" w:color="auto" w:fill="F2F5F8"/>
+            <w:shd w:val="clear" w:color="auto" w:fill="F5F7FA"/>
           </w:tcPr>
           <w:p>
             <w:pPr>
@@ -2015,7 +2259,7 @@
             <w:tcBorders>
               <w:bottom w:val="single" w:sz="6" w:space="0" w:color="000000"/>
             </w:tcBorders>
-            <w:shd w:val="clear" w:color="auto" w:fill="F2F5F8"/>
+            <w:shd w:val="clear" w:color="auto" w:fill="F5F7FA"/>
           </w:tcPr>
           <w:p>
             <w:pPr>
@@ -2031,7 +2275,7 @@
                 <w:sz w:val="19"/>
                 <w:rFonts w:ascii="Arial" w:hAnsi="Arial" w:eastAsia="SimHei"/>
               </w:rPr>
-              <w:t>外部质谱真值</w:t>
+              <w:t>质谱材料参考值</w:t>
             </w:r>
           </w:p>
         </w:tc>
@@ -2041,7 +2285,7 @@
             <w:tcBorders>
               <w:bottom w:val="single" w:sz="6" w:space="0" w:color="000000"/>
             </w:tcBorders>
-            <w:shd w:val="clear" w:color="auto" w:fill="F2F5F8"/>
+            <w:shd w:val="clear" w:color="auto" w:fill="F5F7FA"/>
           </w:tcPr>
           <w:p>
             <w:pPr>
@@ -2067,7 +2311,7 @@
             <w:tcBorders>
               <w:bottom w:val="single" w:sz="6" w:space="0" w:color="000000"/>
             </w:tcBorders>
-            <w:shd w:val="clear" w:color="auto" w:fill="F2F5F8"/>
+            <w:shd w:val="clear" w:color="auto" w:fill="F5F7FA"/>
           </w:tcPr>
           <w:p>
             <w:pPr>
@@ -2083,7 +2327,7 @@
                 <w:sz w:val="19"/>
                 <w:rFonts w:ascii="Arial" w:hAnsi="Arial" w:eastAsia="SimHei"/>
               </w:rPr>
-              <w:t>盲测 MAE (pp)</w:t>
+              <w:t>材料比较 MAE</w:t>
             </w:r>
           </w:p>
         </w:tc>
@@ -2093,7 +2337,7 @@
             <w:tcBorders>
               <w:bottom w:val="single" w:sz="6" w:space="0" w:color="000000"/>
             </w:tcBorders>
-            <w:shd w:val="clear" w:color="auto" w:fill="F2F5F8"/>
+            <w:shd w:val="clear" w:color="auto" w:fill="F5F7FA"/>
           </w:tcPr>
           <w:p>
             <w:pPr>
@@ -2119,7 +2363,7 @@
             <w:tcBorders>
               <w:bottom w:val="single" w:sz="6" w:space="0" w:color="000000"/>
             </w:tcBorders>
-            <w:shd w:val="clear" w:color="auto" w:fill="F2F5F8"/>
+            <w:shd w:val="clear" w:color="auto" w:fill="F5F7FA"/>
           </w:tcPr>
           <w:p>
             <w:pPr>
@@ -3404,20 +3648,20 @@
           <w:rFonts w:ascii="Arial" w:hAnsi="Arial"/>
           <w:b/>
           <w:i w:val="0"/>
-          <w:sz w:val="22"/>
+          <w:sz w:val="21"/>
           <w:rFonts w:ascii="Arial" w:hAnsi="Arial" w:eastAsia="SimSun"/>
         </w:rPr>
-        <w:t>重大发现：</w:t>
+        <w:t>对比观察：</w:t>
       </w:r>
       <w:r>
         <w:rPr>
           <w:rFonts w:ascii="Arial" w:hAnsi="Arial"/>
           <w:b w:val="0"/>
           <w:i w:val="0"/>
-          <w:sz w:val="22"/>
+          <w:sz w:val="21"/>
           <w:rFonts w:ascii="Arial" w:hAnsi="Arial" w:eastAsia="SimSun"/>
         </w:rPr>
-        <w:t>外部盲测极具生物学启发性：在实际临床食管鳞癌肿瘤组织中，四个目标的预测均值与外部质谱真值近乎完美重合！</w:t>
+        <w:t>从外部验证结果中可以观察到两个鲜明现象：</w:t>
       </w:r>
     </w:p>
     <w:p>
@@ -3444,7 +3688,7 @@
           <w:sz w:val="21"/>
           <w:rFonts w:ascii="Arial" w:hAnsi="Arial" w:eastAsia="SimSun"/>
         </w:rPr>
-        <w:t>Kla DDR：</w:t>
+        <w:t>肿瘤预测一致性高：</w:t>
       </w:r>
       <w:r>
         <w:rPr>
@@ -3454,7 +3698,7 @@
           <w:sz w:val="21"/>
           <w:rFonts w:ascii="Arial" w:hAnsi="Arial" w:eastAsia="SimSun"/>
         </w:rPr>
-        <w:t>Kla 组 DDR 占比：外部质谱测定真值为 6.831%，模型盲测预测均值为 6.750%，MAE 仅 0.190 个百分点 (100% 在 ±1 pp 内)；</w:t>
+        <w:t>在 ESCC 肿瘤组织中，四个目标的模型预测均值与新质谱参考值高度吻合：Kla-DDR 参考值为 6.831%，预测均值为 6.750%（误差 0.190 个百分点）；Kla-Repair 参考值为 4.797%，预测均值为 4.730%（误差 0.159 个百分点）；普通组两目标的误差仅为 0.143 和 0.052 个百分点，所有 23 条肿瘤 RNA 样本的误差均在 ±1 个百分点以内，且显著优于基线；</w:t>
       </w:r>
     </w:p>
     <w:p>
@@ -3481,7 +3725,7 @@
           <w:sz w:val="21"/>
           <w:rFonts w:ascii="Arial" w:hAnsi="Arial" w:eastAsia="SimSun"/>
         </w:rPr>
-        <w:t>Kla Repair：</w:t>
+        <w:t>癌旁预测偏低：</w:t>
       </w:r>
       <w:r>
         <w:rPr>
@@ -3491,7 +3735,100 @@
           <w:sz w:val="21"/>
           <w:rFonts w:ascii="Arial" w:hAnsi="Arial" w:eastAsia="SimSun"/>
         </w:rPr>
-        <w:t>Kla 组 DNA repair 占比：外部质谱测定真值为 4.797%，模型盲测预测均值为 4.730%，MAE 仅 0.159 个百分点 (100% 在 ±1 pp 内)；</w:t>
+        <w:t>在配对癌旁组织中，Kla 组两个目标的预测均值出现了一定程度的偏低：Kla-DDR 参考值为 8.898%，模型预测均值为 7.017%（误差 1.881 个百分点）；Kla-Repair 参考值为 5.932%，模型预测均值为 4.899%（误差 1.033 个百分点），未优于无 RNA 基线。</w:t>
+      </w:r>
+    </w:p>
+    <w:p>
+      <w:pPr>
+        <w:keepNext/>
+        <w:spacing w:before="280" w:after="100"/>
+      </w:pPr>
+      <w:r>
+        <w:rPr>
+          <w:rFonts w:ascii="Arial" w:hAnsi="Arial"/>
+          <w:b/>
+          <w:i w:val="0"/>
+          <w:color w:val="19375F"/>
+          <w:sz w:val="26"/>
+          <w:rFonts w:ascii="Arial" w:hAnsi="Arial" w:eastAsia="SimHei"/>
+        </w:rPr>
+        <w:t>五、结果分析与适用边界</w:t>
+      </w:r>
+    </w:p>
+    <w:p>
+      <w:pPr>
+        <w:keepNext/>
+        <w:spacing w:before="180" w:after="60"/>
+      </w:pPr>
+      <w:r>
+        <w:rPr>
+          <w:rFonts w:ascii="Arial" w:hAnsi="Arial"/>
+          <w:b/>
+          <w:i w:val="0"/>
+          <w:color w:val="284B78"/>
+          <w:sz w:val="23"/>
+          <w:rFonts w:ascii="Arial" w:hAnsi="Arial" w:eastAsia="SimHei"/>
+        </w:rPr>
+        <w:t>5.1 为什么组学内占比在外部肿瘤中吻合度更好？</w:t>
+      </w:r>
+    </w:p>
+    <w:p>
+      <w:pPr>
+        <w:spacing w:line="300" w:lineRule="auto" w:before="0" w:after="60"/>
+        <w:ind w:firstLine="420"/>
+      </w:pPr>
+      <w:r>
+        <w:rPr>
+          <w:rFonts w:ascii="Arial" w:hAnsi="Arial"/>
+          <w:b w:val="0"/>
+          <w:i w:val="0"/>
+          <w:sz w:val="21"/>
+          <w:rFonts w:ascii="Arial" w:hAnsi="Arial" w:eastAsia="SimSun"/>
+        </w:rPr>
+        <w:t>此前基于两组学交集比值的预测模型在外部验证中出现约 9 个百分点的偏移，主要原因在于抗体富集深度差异改变了两套质谱检出列表的交集大小。而本次采用的【组学内部组成比例】仅依赖单一组学自身的检出总量作为分母，反映的是恶性肿瘤细胞总蛋白池或总修饰池中分配给特定修复通路的固有比例。这类基础组分构成在同类肿瘤细胞中表现出较高的稳态特性，因而减少了跨实验室富集深度波动带来的影响。</w:t>
+      </w:r>
+    </w:p>
+    <w:p>
+      <w:pPr>
+        <w:keepNext/>
+        <w:spacing w:before="180" w:after="60"/>
+      </w:pPr>
+      <w:r>
+        <w:rPr>
+          <w:rFonts w:ascii="Arial" w:hAnsi="Arial"/>
+          <w:b/>
+          <w:i w:val="0"/>
+          <w:color w:val="284B78"/>
+          <w:sz w:val="23"/>
+          <w:rFonts w:ascii="Arial" w:hAnsi="Arial" w:eastAsia="SimHei"/>
+        </w:rPr>
+        <w:t>5.2 癌旁组织偏离的可能原因与客观限制</w:t>
+      </w:r>
+    </w:p>
+    <w:p>
+      <w:pPr>
+        <w:spacing w:line="300" w:lineRule="auto" w:before="0" w:after="60"/>
+        <w:ind w:firstLine="420"/>
+      </w:pPr>
+      <w:r>
+        <w:rPr>
+          <w:rFonts w:ascii="Arial" w:hAnsi="Arial"/>
+          <w:b/>
+          <w:i w:val="0"/>
+          <w:sz w:val="21"/>
+          <w:rFonts w:ascii="Arial" w:hAnsi="Arial" w:eastAsia="SimSun"/>
+        </w:rPr>
+        <w:t>潜在限制：</w:t>
+      </w:r>
+      <w:r>
+        <w:rPr>
+          <w:rFonts w:ascii="Arial" w:hAnsi="Arial"/>
+          <w:b w:val="0"/>
+          <w:i w:val="0"/>
+          <w:sz w:val="21"/>
+          <w:rFonts w:ascii="Arial" w:hAnsi="Arial" w:eastAsia="SimSun"/>
+        </w:rPr>
+        <w:t>癌旁组织中 Kla 占比预测偏低，可能与以下因素有关：</w:t>
       </w:r>
     </w:p>
     <w:p>
@@ -3518,7 +3855,7 @@
           <w:sz w:val="21"/>
           <w:rFonts w:ascii="Arial" w:hAnsi="Arial" w:eastAsia="SimSun"/>
         </w:rPr>
-        <w:t>普通组通路：</w:t>
+        <w:t>取材与异质性：</w:t>
       </w:r>
       <w:r>
         <w:rPr>
@@ -3528,7 +3865,7 @@
           <w:sz w:val="21"/>
           <w:rFonts w:ascii="Arial" w:hAnsi="Arial" w:eastAsia="SimSun"/>
         </w:rPr>
-        <w:t>普通组 DDR 与 DNA repair 占比的 MAE 分别低至 0.143 和 0.052 个百分点，全面显著优于无 RNA 基线；</w:t>
+        <w:t>癌旁组织细胞异质性较高：癌旁切片常混杂间质细胞、浸润免疫细胞及不同程度的慢性炎症改变，其 RNA 表达谱与纯肿瘤组织存在显著差异，且各实验室取材距肿瘤边缘的距离并不统一；</w:t>
       </w:r>
     </w:p>
     <w:p>
@@ -3555,7 +3892,7 @@
           <w:sz w:val="21"/>
           <w:rFonts w:ascii="Arial" w:hAnsi="Arial" w:eastAsia="SimSun"/>
         </w:rPr>
-        <w:t>组织特异性：</w:t>
+        <w:t>正常组织样本偏少：</w:t>
       </w:r>
       <w:r>
         <w:rPr>
@@ -3565,100 +3902,7 @@
           <w:sz w:val="21"/>
           <w:rFonts w:ascii="Arial" w:hAnsi="Arial" w:eastAsia="SimSun"/>
         </w:rPr>
-        <w:t>癌旁组织的 Kla 误差相对偏大（1.0 ~ 1.8 个百分点），反映出肿瘤组织相较于癌旁具有更为鲜明、稳定的转录组-蛋白质组偶联特征。</w:t>
-      </w:r>
-    </w:p>
-    <w:p>
-      <w:pPr>
-        <w:keepNext/>
-        <w:spacing w:before="280" w:after="120"/>
-      </w:pPr>
-      <w:r>
-        <w:rPr>
-          <w:rFonts w:ascii="Arial" w:hAnsi="Arial"/>
-          <w:b/>
-          <w:i w:val="0"/>
-          <w:color w:val="1F4E79"/>
-          <w:sz w:val="27"/>
-          <w:rFonts w:ascii="Arial" w:hAnsi="Arial" w:eastAsia="SimHei"/>
-        </w:rPr>
-        <w:t>五、科学讨论与向导师汇报建议 (Discussion &amp; Defense)</w:t>
-      </w:r>
-    </w:p>
-    <w:p>
-      <w:pPr>
-        <w:keepNext/>
-        <w:spacing w:before="200" w:after="80"/>
-      </w:pPr>
-      <w:r>
-        <w:rPr>
-          <w:rFonts w:ascii="Arial" w:hAnsi="Arial"/>
-          <w:b/>
-          <w:i w:val="0"/>
-          <w:color w:val="2C5A87"/>
-          <w:sz w:val="24"/>
-          <w:rFonts w:ascii="Arial" w:hAnsi="Arial" w:eastAsia="SimHei"/>
-        </w:rPr>
-        <w:t>5.1 为什么这一版外部盲测效果如此突出？</w:t>
-      </w:r>
-    </w:p>
-    <w:p>
-      <w:pPr>
-        <w:spacing w:line="300" w:lineRule="auto" w:before="0" w:after="60"/>
-        <w:ind w:firstLine="420"/>
-      </w:pPr>
-      <w:r>
-        <w:rPr>
-          <w:rFonts w:ascii="Arial" w:hAnsi="Arial"/>
-          <w:b w:val="0"/>
-          <w:i w:val="0"/>
-          <w:sz w:val="22"/>
-          <w:rFonts w:ascii="Arial" w:hAnsi="Arial" w:eastAsia="SimSun"/>
-        </w:rPr>
-        <w:t>核心原因在于指标定义的生物学合理性：此前的‘Kla ∩ Proteome / Proteome’是两套独立色谱质谱实验交集的比值，受制于不同实验室抗体富集深度与洗脱效率的差异，容易产生系统性基线平移；而本轮采用的【组学内部组成比例】（图 1a 口径）衡量的是细胞内总蛋白质池或总乳酸化修饰池中，分配给 DNA 损伤修复通路的固有资源配比（Resource Allocation）。这一比例在恶性肿瘤细胞中具有极强的进化保守性与稳态特征，因此全转录组特征能够以极高保真度跨实验室直接映射！</w:t>
-      </w:r>
-    </w:p>
-    <w:p>
-      <w:pPr>
-        <w:keepNext/>
-        <w:spacing w:before="200" w:after="80"/>
-      </w:pPr>
-      <w:r>
-        <w:rPr>
-          <w:rFonts w:ascii="Arial" w:hAnsi="Arial"/>
-          <w:b/>
-          <w:i w:val="0"/>
-          <w:color w:val="2C5A87"/>
-          <w:sz w:val="24"/>
-          <w:rFonts w:ascii="Arial" w:hAnsi="Arial" w:eastAsia="SimHei"/>
-        </w:rPr>
-        <w:t>5.2 向导师汇报的建议口径</w:t>
-      </w:r>
-    </w:p>
-    <w:p>
-      <w:pPr>
-        <w:spacing w:line="300" w:lineRule="auto" w:before="0" w:after="60"/>
-        <w:ind w:firstLine="420"/>
-      </w:pPr>
-      <w:r>
-        <w:rPr>
-          <w:rFonts w:ascii="Arial" w:hAnsi="Arial"/>
-          <w:b/>
-          <w:i w:val="0"/>
-          <w:sz w:val="22"/>
-          <w:rFonts w:ascii="Arial" w:hAnsi="Arial" w:eastAsia="SimSun"/>
-        </w:rPr>
-        <w:t>汇报建议：</w:t>
-      </w:r>
-      <w:r>
-        <w:rPr>
-          <w:rFonts w:ascii="Arial" w:hAnsi="Arial"/>
-          <w:b w:val="0"/>
-          <w:i w:val="0"/>
-          <w:sz w:val="22"/>
-          <w:rFonts w:ascii="Arial" w:hAnsi="Arial" w:eastAsia="SimSun"/>
-        </w:rPr>
-        <w:t>建议按以下脉络向老师汇报：</w:t>
+        <w:t>训练材料覆盖度不均衡：现有训练集中正常食管组织样本数量极少，模型对食管鳞状上皮在非癌状态下的修饰特征学习不够充分；</w:t>
       </w:r>
     </w:p>
     <w:p>
@@ -3685,7 +3929,7 @@
           <w:sz w:val="21"/>
           <w:rFonts w:ascii="Arial" w:hAnsi="Arial" w:eastAsia="SimSun"/>
         </w:rPr>
-        <w:t>汇报核心亮点：</w:t>
+        <w:t>非个体配对限制：</w:t>
       </w:r>
       <w:r>
         <w:rPr>
@@ -3695,35 +3939,31 @@
           <w:sz w:val="21"/>
           <w:rFonts w:ascii="Arial" w:hAnsi="Arial" w:eastAsia="SimSun"/>
         </w:rPr>
-        <w:t>“老师，按照图 1a 的定义，我们把目标纠正为普通组和 Kla 组各自内部的通路构成比，输入全转录组 18,332 个基因重构了四个模型。这一纠偏效果极其显著：在外部全新的食管鳞癌队列盲测中（PXD063945 质谱真值 + GSE130078 组织 RNA），肿瘤组织内四个目标的平均绝对误差全部降到了 0.05 ~ 0.19 个百分点，100% 落在 ±1 个百分点以内，显著优于基线！”</w:t>
+        <w:t>队列非同一患者多组学配对：RNA 来自韩国 YSH 队列，质谱来自华山医院，两者仅在组织病理层面匹配，无法排除人群遗传背景、生活方式及未知临床治疗史对基线修饰水平的影响。</w:t>
       </w:r>
     </w:p>
     <w:p>
       <w:pPr>
-        <w:spacing w:line="300" w:lineRule="auto" w:before="20" w:after="40"/>
-        <w:ind w:left="420" w:hanging="227"/>
+        <w:keepNext/>
+        <w:spacing w:before="180" w:after="60"/>
       </w:pPr>
       <w:r>
         <w:rPr>
           <w:rFonts w:ascii="Arial" w:hAnsi="Arial"/>
           <w:b/>
           <w:i w:val="0"/>
-          <w:color w:val="1F4E79"/>
-          <w:sz w:val="19"/>
-          <w:rFonts w:ascii="Arial" w:hAnsi="Arial" w:eastAsia="SimSun"/>
+          <w:color w:val="284B78"/>
+          <w:sz w:val="23"/>
+          <w:rFonts w:ascii="Arial" w:hAnsi="Arial" w:eastAsia="SimHei"/>
         </w:rPr>
-        <w:t xml:space="preserve">▪ </w:t>
+        <w:t>5.3 结论与建议</w:t>
       </w:r>
-      <w:r>
-        <w:rPr>
-          <w:rFonts w:ascii="Arial" w:hAnsi="Arial"/>
-          <w:b/>
-          <w:i w:val="0"/>
-          <w:sz w:val="21"/>
-          <w:rFonts w:ascii="Arial" w:hAnsi="Arial" w:eastAsia="SimSun"/>
-        </w:rPr>
-        <w:t>严谨归因：</w:t>
-      </w:r>
+    </w:p>
+    <w:p>
+      <w:pPr>
+        <w:spacing w:line="300" w:lineRule="auto" w:before="0" w:after="60"/>
+        <w:ind w:firstLine="420"/>
+      </w:pPr>
       <w:r>
         <w:rPr>
           <w:rFonts w:ascii="Arial" w:hAnsi="Arial"/>
@@ -3732,24 +3972,43 @@
           <w:sz w:val="21"/>
           <w:rFonts w:ascii="Arial" w:hAnsi="Arial" w:eastAsia="SimSun"/>
         </w:rPr>
-        <w:t>“这充分证明：组学内部的通路蛋白构成比具有极高的生物学稳定性，模型成功跨越了不同实验室的批次效应，展现出优秀的跨队列泛化能力。”</w:t>
+        <w:t>综上所述，当前模型在肿瘤组织内的表现支持其作为‘已知材料体系内基于全转录组特征重现组学内通路占比’的有效工具。但面对正常/癌旁组织或更广泛的非肿瘤材料时，模型尚不能做到无条件准确预测。若要在未来开展真正的盲测应用，仍需在固定模型的前提下，引入小批量同批次配对基准数据进行局部标定。</w:t>
       </w:r>
     </w:p>
     <w:p>
       <w:pPr>
         <w:keepNext/>
-        <w:spacing w:before="280" w:after="120"/>
+        <w:spacing w:before="280" w:after="100"/>
       </w:pPr>
       <w:r>
         <w:rPr>
           <w:rFonts w:ascii="Arial" w:hAnsi="Arial"/>
           <w:b/>
           <w:i w:val="0"/>
-          <w:color w:val="1F4E79"/>
-          <w:sz w:val="27"/>
+          <w:color w:val="19375F"/>
+          <w:sz w:val="26"/>
           <w:rFonts w:ascii="Arial" w:hAnsi="Arial" w:eastAsia="SimHei"/>
         </w:rPr>
-        <w:t>六、交付文件索引 (File Index)</w:t>
+        <w:t>六、交付文件与数据索引</w:t>
+      </w:r>
+    </w:p>
+    <w:p>
+      <w:pPr>
+        <w:keepNext/>
+        <w:spacing w:before="120" w:after="80"/>
+        <w:ind w:firstLine="0"/>
+        <w:jc w:val="center"/>
+      </w:pPr>
+      <w:r>
+        <w:rPr>
+          <w:rFonts w:ascii="Arial" w:hAnsi="Arial"/>
+          <w:b/>
+          <w:i w:val="0"/>
+          <w:color w:val="323232"/>
+          <w:sz w:val="20"/>
+          <w:rFonts w:ascii="Arial" w:hAnsi="Arial" w:eastAsia="SimSun"/>
+        </w:rPr>
+        <w:t>表 3 四目标模型交付产出文件路径索引表</w:t>
       </w:r>
     </w:p>
     <w:tbl>
@@ -3781,7 +4040,7 @@
             <w:tcBorders>
               <w:bottom w:val="single" w:sz="6" w:space="0" w:color="000000"/>
             </w:tcBorders>
-            <w:shd w:val="clear" w:color="auto" w:fill="F2F5F8"/>
+            <w:shd w:val="clear" w:color="auto" w:fill="F5F7FA"/>
           </w:tcPr>
           <w:p>
             <w:pPr>
@@ -3807,7 +4066,7 @@
             <w:tcBorders>
               <w:bottom w:val="single" w:sz="6" w:space="0" w:color="000000"/>
             </w:tcBorders>
-            <w:shd w:val="clear" w:color="auto" w:fill="F2F5F8"/>
+            <w:shd w:val="clear" w:color="auto" w:fill="F5F7FA"/>
           </w:tcPr>
           <w:p>
             <w:pPr>
@@ -3833,7 +4092,7 @@
             <w:tcBorders>
               <w:bottom w:val="single" w:sz="6" w:space="0" w:color="000000"/>
             </w:tcBorders>
-            <w:shd w:val="clear" w:color="auto" w:fill="F2F5F8"/>
+            <w:shd w:val="clear" w:color="auto" w:fill="F5F7FA"/>
           </w:tcPr>
           <w:p>
             <w:pPr>
@@ -3917,7 +4176,7 @@
                 <w:sz w:val="19"/>
                 <w:rFonts w:ascii="Arial" w:hAnsi="Arial" w:eastAsia="SimSun"/>
               </w:rPr>
-              <w:t>四大目标全景评价指标表 (含基线对照)</w:t>
+              <w:t>四目标全景评价指标表 (含基线对照)</w:t>
             </w:r>
           </w:p>
         </w:tc>
@@ -3985,7 +4244,7 @@
                 <w:sz w:val="19"/>
                 <w:rFonts w:ascii="Arial" w:hAnsi="Arial" w:eastAsia="SimSun"/>
               </w:rPr>
-              <w:t>新 RNA 食管癌肿瘤与癌旁逐项目盲测明细表</w:t>
+              <w:t>新 RNA 食管癌肿瘤与癌旁逐项指标明细表</w:t>
             </w:r>
           </w:p>
         </w:tc>
@@ -4053,7 +4312,7 @@
                 <w:sz w:val="19"/>
                 <w:rFonts w:ascii="Arial" w:hAnsi="Arial" w:eastAsia="SimSun"/>
               </w:rPr>
-              <w:t>四大目标内部留出预测 4 联散点图</w:t>
+              <w:t>四目标内部留出预测 4 联散点图</w:t>
             </w:r>
           </w:p>
         </w:tc>
@@ -4189,7 +4448,7 @@
                 <w:sz w:val="19"/>
                 <w:rFonts w:ascii="Arial" w:hAnsi="Arial" w:eastAsia="SimSun"/>
               </w:rPr>
-              <w:t>GSE130078 组织 RNA 盲测外部质谱真值分布图</w:t>
+              <w:t>GSE130078 组织 RNA 盲测外部质谱参考值分布图</w:t>
             </w:r>
           </w:p>
         </w:tc>
@@ -4213,7 +4472,7 @@
                 <w:sz w:val="19"/>
                 <w:rFonts w:ascii="Arial" w:hAnsi="Arial" w:eastAsia="SimSun"/>
               </w:rPr>
-              <w:t>Word 主报告</w:t>
+              <w:t>主报告文件</w:t>
             </w:r>
           </w:p>
         </w:tc>
@@ -4325,7 +4584,7 @@
                 <w:sz w:val="19"/>
                 <w:rFonts w:ascii="Arial" w:hAnsi="Arial" w:eastAsia="SimSun"/>
               </w:rPr>
-              <w:t>直接供审阅与交付导师的桌面端 Word 副本</w:t>
+              <w:t>直接供审阅与交付的桌面端 Word 副本</w:t>
             </w:r>
           </w:p>
         </w:tc>
@@ -4389,7 +4648,7 @@
         <w:color w:val="808080"/>
         <w:sz w:val="17"/>
       </w:rPr>
-      <w:t>人类乳酸化修饰组学与 DDR 机制分析项目 · 专项实验报告</w:t>
+      <w:t>人类乳酸化修饰组学与 DDR 机制分析 · 实验研究报告</w:t>
     </w:r>
   </w:p>
 </w:hdr>

</xml_diff>

<commit_message>
Generate and embed full suite of extended diagnostic figures for Figure 1a four-target models
</commit_message>
<xml_diff>
--- a/reports/图1a口径四目标RNA预测模型及外部盲测实验报告_20260929.docx
+++ b/reports/图1a口径四目标RNA预测模型及外部盲测实验报告_20260929.docx
@@ -1872,7 +1872,7 @@
           <w:sz w:val="26"/>
           <w:rFonts w:ascii="Arial" w:hAnsi="Arial" w:eastAsia="SimHei"/>
         </w:rPr>
-        <w:t>三、模型训练与内部留出结果</w:t>
+        <w:t>三、四目标模型训练与内部留出结果</w:t>
       </w:r>
     </w:p>
     <w:p>
@@ -2059,7 +2059,562 @@
           <w:sz w:val="26"/>
           <w:rFonts w:ascii="Arial" w:hAnsi="Arial" w:eastAsia="SimHei"/>
         </w:rPr>
-        <w:t>四、外部独立队列的材料级对照验证</w:t>
+        <w:t>四、Kla 组模型的扩展诊断与机制解析</w:t>
+      </w:r>
+    </w:p>
+    <w:p>
+      <w:pPr>
+        <w:spacing w:line="300" w:lineRule="auto" w:before="0" w:after="60"/>
+        <w:ind w:firstLine="420"/>
+      </w:pPr>
+      <w:r>
+        <w:rPr>
+          <w:rFonts w:ascii="Arial" w:hAnsi="Arial"/>
+          <w:b w:val="0"/>
+          <w:i w:val="0"/>
+          <w:sz w:val="21"/>
+          <w:rFonts w:ascii="Arial" w:hAnsi="Arial" w:eastAsia="SimSun"/>
+        </w:rPr>
+        <w:t>为深入评估核心关注的 Kla 修饰目标（Kla_DDR 与 Kla_DNA_repair），本节提供了材料分布、变量重要性、流形投影及残差诊断等扩展图表：</w:t>
+      </w:r>
+    </w:p>
+    <w:p>
+      <w:pPr>
+        <w:keepNext/>
+        <w:spacing w:before="180" w:after="60"/>
+      </w:pPr>
+      <w:r>
+        <w:rPr>
+          <w:rFonts w:ascii="Arial" w:hAnsi="Arial"/>
+          <w:b/>
+          <w:i w:val="0"/>
+          <w:color w:val="284B78"/>
+          <w:sz w:val="23"/>
+          <w:rFonts w:ascii="Arial" w:hAnsi="Arial" w:eastAsia="SimHei"/>
+        </w:rPr>
+        <w:t>4.1 Kla 组 · DDR 占比模型扩展图集</w:t>
+      </w:r>
+    </w:p>
+    <w:p>
+      <w:pPr>
+        <w:keepNext/>
+        <w:spacing w:before="120" w:after="40"/>
+        <w:ind w:firstLine="0"/>
+        <w:jc w:val="center"/>
+      </w:pPr>
+      <w:r>
+        <w:drawing>
+          <wp:inline xmlns:a="http://schemas.openxmlformats.org/drawingml/2006/main" xmlns:pic="http://schemas.openxmlformats.org/drawingml/2006/picture">
+            <wp:extent cx="5580000" cy="2385931"/>
+            <wp:docPr id="3" name="Picture 3"/>
+            <wp:cNvGraphicFramePr>
+              <a:graphicFrameLocks noChangeAspect="1"/>
+            </wp:cNvGraphicFramePr>
+            <a:graphic>
+              <a:graphicData uri="http://schemas.openxmlformats.org/drawingml/2006/picture">
+                <pic:pic>
+                  <pic:nvPicPr>
+                    <pic:cNvPr id="0" name="figure1_material_distributions.png"/>
+                    <pic:cNvPicPr/>
+                  </pic:nvPicPr>
+                  <pic:blipFill>
+                    <a:blip r:embed="rId13"/>
+                    <a:stretch>
+                      <a:fillRect/>
+                    </a:stretch>
+                  </pic:blipFill>
+                  <pic:spPr>
+                    <a:xfrm>
+                      <a:off x="0" y="0"/>
+                      <a:ext cx="5580000" cy="2385931"/>
+                    </a:xfrm>
+                    <a:prstGeom prst="rect"/>
+                  </pic:spPr>
+                </pic:pic>
+              </a:graphicData>
+            </a:graphic>
+          </wp:inline>
+        </w:drawing>
+      </w:r>
+    </w:p>
+    <w:p>
+      <w:pPr>
+        <w:keepNext w:val="0"/>
+        <w:spacing w:before="80" w:after="160"/>
+        <w:ind w:firstLine="0"/>
+        <w:jc w:val="center"/>
+      </w:pPr>
+      <w:r>
+        <w:rPr>
+          <w:rFonts w:ascii="Arial" w:hAnsi="Arial"/>
+          <w:b/>
+          <w:i w:val="0"/>
+          <w:color w:val="323232"/>
+          <w:sz w:val="20"/>
+          <w:rFonts w:ascii="Arial" w:hAnsi="Arial" w:eastAsia="SimSun"/>
+        </w:rPr>
+        <w:t>图 3 Kla 组 · DDR 占比模型在 28 种材料内部的预测分布与实测值对比图 (金色菱形为材料参考值)</w:t>
+      </w:r>
+    </w:p>
+    <w:p>
+      <w:pPr>
+        <w:keepNext/>
+        <w:spacing w:before="120" w:after="40"/>
+        <w:ind w:firstLine="0"/>
+        <w:jc w:val="center"/>
+      </w:pPr>
+      <w:r>
+        <w:drawing>
+          <wp:inline xmlns:a="http://schemas.openxmlformats.org/drawingml/2006/main" xmlns:pic="http://schemas.openxmlformats.org/drawingml/2006/picture">
+            <wp:extent cx="4500000" cy="3825000"/>
+            <wp:docPr id="4" name="Picture 4"/>
+            <wp:cNvGraphicFramePr>
+              <a:graphicFrameLocks noChangeAspect="1"/>
+            </wp:cNvGraphicFramePr>
+            <a:graphic>
+              <a:graphicData uri="http://schemas.openxmlformats.org/drawingml/2006/picture">
+                <pic:pic>
+                  <pic:nvPicPr>
+                    <pic:cNvPr id="0" name="top25.png"/>
+                    <pic:cNvPicPr/>
+                  </pic:nvPicPr>
+                  <pic:blipFill>
+                    <a:blip r:embed="rId14"/>
+                    <a:stretch>
+                      <a:fillRect/>
+                    </a:stretch>
+                  </pic:blipFill>
+                  <pic:spPr>
+                    <a:xfrm>
+                      <a:off x="0" y="0"/>
+                      <a:ext cx="4500000" cy="3825000"/>
+                    </a:xfrm>
+                    <a:prstGeom prst="rect"/>
+                  </pic:spPr>
+                </pic:pic>
+              </a:graphicData>
+            </a:graphic>
+          </wp:inline>
+        </w:drawing>
+      </w:r>
+    </w:p>
+    <w:p>
+      <w:pPr>
+        <w:keepNext w:val="0"/>
+        <w:spacing w:before="80" w:after="160"/>
+        <w:ind w:firstLine="0"/>
+        <w:jc w:val="center"/>
+      </w:pPr>
+      <w:r>
+        <w:rPr>
+          <w:rFonts w:ascii="Arial" w:hAnsi="Arial"/>
+          <w:b/>
+          <w:i w:val="0"/>
+          <w:color w:val="323232"/>
+          <w:sz w:val="20"/>
+          <w:rFonts w:ascii="Arial" w:hAnsi="Arial" w:eastAsia="SimSun"/>
+        </w:rPr>
+        <w:t>图 4 Kla 组 · DDR 占比模型训练集 Top 25 变量重要性条形图 (带官方 Gene Symbol 标注)</w:t>
+      </w:r>
+    </w:p>
+    <w:p>
+      <w:pPr>
+        <w:keepNext/>
+        <w:spacing w:before="120" w:after="40"/>
+        <w:ind w:firstLine="0"/>
+        <w:jc w:val="center"/>
+      </w:pPr>
+      <w:r>
+        <w:drawing>
+          <wp:inline xmlns:a="http://schemas.openxmlformats.org/drawingml/2006/main" xmlns:pic="http://schemas.openxmlformats.org/drawingml/2006/picture">
+            <wp:extent cx="5580000" cy="2001103"/>
+            <wp:docPr id="5" name="Picture 5"/>
+            <wp:cNvGraphicFramePr>
+              <a:graphicFrameLocks noChangeAspect="1"/>
+            </wp:cNvGraphicFramePr>
+            <a:graphic>
+              <a:graphicData uri="http://schemas.openxmlformats.org/drawingml/2006/picture">
+                <pic:pic>
+                  <pic:nvPicPr>
+                    <pic:cNvPr id="0" name="figure3_manifold_projection.png"/>
+                    <pic:cNvPicPr/>
+                  </pic:nvPicPr>
+                  <pic:blipFill>
+                    <a:blip r:embed="rId15"/>
+                    <a:stretch>
+                      <a:fillRect/>
+                    </a:stretch>
+                  </pic:blipFill>
+                  <pic:spPr>
+                    <a:xfrm>
+                      <a:off x="0" y="0"/>
+                      <a:ext cx="5580000" cy="2001103"/>
+                    </a:xfrm>
+                    <a:prstGeom prst="rect"/>
+                  </pic:spPr>
+                </pic:pic>
+              </a:graphicData>
+            </a:graphic>
+          </wp:inline>
+        </w:drawing>
+      </w:r>
+    </w:p>
+    <w:p>
+      <w:pPr>
+        <w:keepNext w:val="0"/>
+        <w:spacing w:before="80" w:after="160"/>
+        <w:ind w:firstLine="0"/>
+        <w:jc w:val="center"/>
+      </w:pPr>
+      <w:r>
+        <w:rPr>
+          <w:rFonts w:ascii="Arial" w:hAnsi="Arial"/>
+          <w:b/>
+          <w:i w:val="0"/>
+          <w:color w:val="323232"/>
+          <w:sz w:val="20"/>
+          <w:rFonts w:ascii="Arial" w:hAnsi="Arial" w:eastAsia="SimSun"/>
+        </w:rPr>
+        <w:t>图 5 Kla 组 · DDR 占比模型转录组 UMAP 流形投影图 (生物分类、实测值与预测值色谱对照)</w:t>
+      </w:r>
+    </w:p>
+    <w:p>
+      <w:pPr>
+        <w:keepNext/>
+        <w:spacing w:before="120" w:after="40"/>
+        <w:ind w:firstLine="0"/>
+        <w:jc w:val="center"/>
+      </w:pPr>
+      <w:r>
+        <w:drawing>
+          <wp:inline xmlns:a="http://schemas.openxmlformats.org/drawingml/2006/main" xmlns:pic="http://schemas.openxmlformats.org/drawingml/2006/picture">
+            <wp:extent cx="5400000" cy="2340000"/>
+            <wp:docPr id="6" name="Picture 6"/>
+            <wp:cNvGraphicFramePr>
+              <a:graphicFrameLocks noChangeAspect="1"/>
+            </wp:cNvGraphicFramePr>
+            <a:graphic>
+              <a:graphicData uri="http://schemas.openxmlformats.org/drawingml/2006/picture">
+                <pic:pic>
+                  <pic:nvPicPr>
+                    <pic:cNvPr id="0" name="figure4_residual_diagnostics.png"/>
+                    <pic:cNvPicPr/>
+                  </pic:nvPicPr>
+                  <pic:blipFill>
+                    <a:blip r:embed="rId16"/>
+                    <a:stretch>
+                      <a:fillRect/>
+                    </a:stretch>
+                  </pic:blipFill>
+                  <pic:spPr>
+                    <a:xfrm>
+                      <a:off x="0" y="0"/>
+                      <a:ext cx="5400000" cy="2340000"/>
+                    </a:xfrm>
+                    <a:prstGeom prst="rect"/>
+                  </pic:spPr>
+                </pic:pic>
+              </a:graphicData>
+            </a:graphic>
+          </wp:inline>
+        </w:drawing>
+      </w:r>
+    </w:p>
+    <w:p>
+      <w:pPr>
+        <w:keepNext w:val="0"/>
+        <w:spacing w:before="80" w:after="160"/>
+        <w:ind w:firstLine="0"/>
+        <w:jc w:val="center"/>
+      </w:pPr>
+      <w:r>
+        <w:rPr>
+          <w:rFonts w:ascii="Arial" w:hAnsi="Arial"/>
+          <w:b/>
+          <w:i w:val="0"/>
+          <w:color w:val="323232"/>
+          <w:sz w:val="20"/>
+          <w:rFonts w:ascii="Arial" w:hAnsi="Arial" w:eastAsia="SimSun"/>
+        </w:rPr>
+        <w:t>图 6 Kla 组 · DDR 占比模型残差诊断图 (LOESS 趋势平滑与误差概率密度分布)</w:t>
+      </w:r>
+    </w:p>
+    <w:p>
+      <w:pPr>
+        <w:keepNext/>
+        <w:spacing w:before="120" w:after="40"/>
+        <w:ind w:firstLine="0"/>
+        <w:jc w:val="center"/>
+      </w:pPr>
+      <w:r>
+        <w:drawing>
+          <wp:inline xmlns:a="http://schemas.openxmlformats.org/drawingml/2006/main" xmlns:pic="http://schemas.openxmlformats.org/drawingml/2006/picture">
+            <wp:extent cx="5580000" cy="2001103"/>
+            <wp:docPr id="7" name="Picture 7"/>
+            <wp:cNvGraphicFramePr>
+              <a:graphicFrameLocks noChangeAspect="1"/>
+            </wp:cNvGraphicFramePr>
+            <a:graphic>
+              <a:graphicData uri="http://schemas.openxmlformats.org/drawingml/2006/picture">
+                <pic:pic>
+                  <pic:nvPicPr>
+                    <pic:cNvPr id="0" name="figure5_category_stratified.png"/>
+                    <pic:cNvPicPr/>
+                  </pic:nvPicPr>
+                  <pic:blipFill>
+                    <a:blip r:embed="rId17"/>
+                    <a:stretch>
+                      <a:fillRect/>
+                    </a:stretch>
+                  </pic:blipFill>
+                  <pic:spPr>
+                    <a:xfrm>
+                      <a:off x="0" y="0"/>
+                      <a:ext cx="5580000" cy="2001103"/>
+                    </a:xfrm>
+                    <a:prstGeom prst="rect"/>
+                  </pic:spPr>
+                </pic:pic>
+              </a:graphicData>
+            </a:graphic>
+          </wp:inline>
+        </w:drawing>
+      </w:r>
+    </w:p>
+    <w:p>
+      <w:pPr>
+        <w:keepNext w:val="0"/>
+        <w:spacing w:before="80" w:after="160"/>
+        <w:ind w:firstLine="0"/>
+        <w:jc w:val="center"/>
+      </w:pPr>
+      <w:r>
+        <w:rPr>
+          <w:rFonts w:ascii="Arial" w:hAnsi="Arial"/>
+          <w:b/>
+          <w:i w:val="0"/>
+          <w:color w:val="323232"/>
+          <w:sz w:val="20"/>
+          <w:rFonts w:ascii="Arial" w:hAnsi="Arial" w:eastAsia="SimSun"/>
+        </w:rPr>
+        <w:t>图 7 Kla 组 · DDR 占比模型按生物学大类 (正常/癌组织、正常/癌细胞系) 分层的盲测散点图</w:t>
+      </w:r>
+    </w:p>
+    <w:p>
+      <w:pPr>
+        <w:keepNext/>
+        <w:spacing w:before="180" w:after="60"/>
+      </w:pPr>
+      <w:r>
+        <w:rPr>
+          <w:rFonts w:ascii="Arial" w:hAnsi="Arial"/>
+          <w:b/>
+          <w:i w:val="0"/>
+          <w:color w:val="284B78"/>
+          <w:sz w:val="23"/>
+          <w:rFonts w:ascii="Arial" w:hAnsi="Arial" w:eastAsia="SimHei"/>
+        </w:rPr>
+        <w:t>4.2 Kla 组 · DNA repair 占比模型扩展图集</w:t>
+      </w:r>
+    </w:p>
+    <w:p>
+      <w:pPr>
+        <w:keepNext/>
+        <w:spacing w:before="120" w:after="40"/>
+        <w:ind w:firstLine="0"/>
+        <w:jc w:val="center"/>
+      </w:pPr>
+      <w:r>
+        <w:drawing>
+          <wp:inline xmlns:a="http://schemas.openxmlformats.org/drawingml/2006/main" xmlns:pic="http://schemas.openxmlformats.org/drawingml/2006/picture">
+            <wp:extent cx="5580000" cy="2385931"/>
+            <wp:docPr id="8" name="Picture 8"/>
+            <wp:cNvGraphicFramePr>
+              <a:graphicFrameLocks noChangeAspect="1"/>
+            </wp:cNvGraphicFramePr>
+            <a:graphic>
+              <a:graphicData uri="http://schemas.openxmlformats.org/drawingml/2006/picture">
+                <pic:pic>
+                  <pic:nvPicPr>
+                    <pic:cNvPr id="0" name="figure1_material_distributions.png"/>
+                    <pic:cNvPicPr/>
+                  </pic:nvPicPr>
+                  <pic:blipFill>
+                    <a:blip r:embed="rId18"/>
+                    <a:stretch>
+                      <a:fillRect/>
+                    </a:stretch>
+                  </pic:blipFill>
+                  <pic:spPr>
+                    <a:xfrm>
+                      <a:off x="0" y="0"/>
+                      <a:ext cx="5580000" cy="2385931"/>
+                    </a:xfrm>
+                    <a:prstGeom prst="rect"/>
+                  </pic:spPr>
+                </pic:pic>
+              </a:graphicData>
+            </a:graphic>
+          </wp:inline>
+        </w:drawing>
+      </w:r>
+    </w:p>
+    <w:p>
+      <w:pPr>
+        <w:keepNext w:val="0"/>
+        <w:spacing w:before="80" w:after="160"/>
+        <w:ind w:firstLine="0"/>
+        <w:jc w:val="center"/>
+      </w:pPr>
+      <w:r>
+        <w:rPr>
+          <w:rFonts w:ascii="Arial" w:hAnsi="Arial"/>
+          <w:b/>
+          <w:i w:val="0"/>
+          <w:color w:val="323232"/>
+          <w:sz w:val="20"/>
+          <w:rFonts w:ascii="Arial" w:hAnsi="Arial" w:eastAsia="SimSun"/>
+        </w:rPr>
+        <w:t>图 8 Kla 组 · DNA repair 占比模型在 28 种材料内部的预测分布与实测值对比图</w:t>
+      </w:r>
+    </w:p>
+    <w:p>
+      <w:pPr>
+        <w:keepNext/>
+        <w:spacing w:before="120" w:after="40"/>
+        <w:ind w:firstLine="0"/>
+        <w:jc w:val="center"/>
+      </w:pPr>
+      <w:r>
+        <w:drawing>
+          <wp:inline xmlns:a="http://schemas.openxmlformats.org/drawingml/2006/main" xmlns:pic="http://schemas.openxmlformats.org/drawingml/2006/picture">
+            <wp:extent cx="4500000" cy="3825000"/>
+            <wp:docPr id="9" name="Picture 9"/>
+            <wp:cNvGraphicFramePr>
+              <a:graphicFrameLocks noChangeAspect="1"/>
+            </wp:cNvGraphicFramePr>
+            <a:graphic>
+              <a:graphicData uri="http://schemas.openxmlformats.org/drawingml/2006/picture">
+                <pic:pic>
+                  <pic:nvPicPr>
+                    <pic:cNvPr id="0" name="top25.png"/>
+                    <pic:cNvPicPr/>
+                  </pic:nvPicPr>
+                  <pic:blipFill>
+                    <a:blip r:embed="rId19"/>
+                    <a:stretch>
+                      <a:fillRect/>
+                    </a:stretch>
+                  </pic:blipFill>
+                  <pic:spPr>
+                    <a:xfrm>
+                      <a:off x="0" y="0"/>
+                      <a:ext cx="4500000" cy="3825000"/>
+                    </a:xfrm>
+                    <a:prstGeom prst="rect"/>
+                  </pic:spPr>
+                </pic:pic>
+              </a:graphicData>
+            </a:graphic>
+          </wp:inline>
+        </w:drawing>
+      </w:r>
+    </w:p>
+    <w:p>
+      <w:pPr>
+        <w:keepNext w:val="0"/>
+        <w:spacing w:before="80" w:after="160"/>
+        <w:ind w:firstLine="0"/>
+        <w:jc w:val="center"/>
+      </w:pPr>
+      <w:r>
+        <w:rPr>
+          <w:rFonts w:ascii="Arial" w:hAnsi="Arial"/>
+          <w:b/>
+          <w:i w:val="0"/>
+          <w:color w:val="323232"/>
+          <w:sz w:val="20"/>
+          <w:rFonts w:ascii="Arial" w:hAnsi="Arial" w:eastAsia="SimSun"/>
+        </w:rPr>
+        <w:t>图 9 Kla 组 · DNA repair 占比模型训练集 Top 25 变量重要性条形图 (带官方 Gene Symbol 标注)</w:t>
+      </w:r>
+    </w:p>
+    <w:p>
+      <w:pPr>
+        <w:keepNext/>
+        <w:spacing w:before="120" w:after="40"/>
+        <w:ind w:firstLine="0"/>
+        <w:jc w:val="center"/>
+      </w:pPr>
+      <w:r>
+        <w:drawing>
+          <wp:inline xmlns:a="http://schemas.openxmlformats.org/drawingml/2006/main" xmlns:pic="http://schemas.openxmlformats.org/drawingml/2006/picture">
+            <wp:extent cx="5400000" cy="2340000"/>
+            <wp:docPr id="10" name="Picture 10"/>
+            <wp:cNvGraphicFramePr>
+              <a:graphicFrameLocks noChangeAspect="1"/>
+            </wp:cNvGraphicFramePr>
+            <a:graphic>
+              <a:graphicData uri="http://schemas.openxmlformats.org/drawingml/2006/picture">
+                <pic:pic>
+                  <pic:nvPicPr>
+                    <pic:cNvPr id="0" name="figure4_residual_diagnostics.png"/>
+                    <pic:cNvPicPr/>
+                  </pic:nvPicPr>
+                  <pic:blipFill>
+                    <a:blip r:embed="rId20"/>
+                    <a:stretch>
+                      <a:fillRect/>
+                    </a:stretch>
+                  </pic:blipFill>
+                  <pic:spPr>
+                    <a:xfrm>
+                      <a:off x="0" y="0"/>
+                      <a:ext cx="5400000" cy="2340000"/>
+                    </a:xfrm>
+                    <a:prstGeom prst="rect"/>
+                  </pic:spPr>
+                </pic:pic>
+              </a:graphicData>
+            </a:graphic>
+          </wp:inline>
+        </w:drawing>
+      </w:r>
+    </w:p>
+    <w:p>
+      <w:pPr>
+        <w:keepNext w:val="0"/>
+        <w:spacing w:before="80" w:after="160"/>
+        <w:ind w:firstLine="0"/>
+        <w:jc w:val="center"/>
+      </w:pPr>
+      <w:r>
+        <w:rPr>
+          <w:rFonts w:ascii="Arial" w:hAnsi="Arial"/>
+          <w:b/>
+          <w:i w:val="0"/>
+          <w:color w:val="323232"/>
+          <w:sz w:val="20"/>
+          <w:rFonts w:ascii="Arial" w:hAnsi="Arial" w:eastAsia="SimSun"/>
+        </w:rPr>
+        <w:t>图 10 Kla 组 · DNA repair 占比模型残差诊断图</w:t>
+      </w:r>
+    </w:p>
+    <w:p>
+      <w:pPr>
+        <w:keepNext/>
+        <w:spacing w:before="280" w:after="100"/>
+      </w:pPr>
+      <w:r>
+        <w:rPr>
+          <w:rFonts w:ascii="Arial" w:hAnsi="Arial"/>
+          <w:b/>
+          <w:i w:val="0"/>
+          <w:color w:val="19375F"/>
+          <w:sz w:val="26"/>
+          <w:rFonts w:ascii="Arial" w:hAnsi="Arial" w:eastAsia="SimHei"/>
+        </w:rPr>
+        <w:t>五、外部独立队列的材料级对照验证</w:t>
       </w:r>
     </w:p>
     <w:p>
@@ -2091,7 +2646,7 @@
           <w:sz w:val="21"/>
           <w:rFonts w:ascii="Arial" w:hAnsi="Arial" w:eastAsia="SimSun"/>
         </w:rPr>
-        <w:t>预测散点与分布如图 3 所示，具体数值详见表 2。</w:t>
+        <w:t>预测散点与分布如图 11 所示，具体数值详见表 2。</w:t>
       </w:r>
     </w:p>
     <w:p>
@@ -2105,7 +2660,7 @@
         <w:drawing>
           <wp:inline xmlns:a="http://schemas.openxmlformats.org/drawingml/2006/main" xmlns:pic="http://schemas.openxmlformats.org/drawingml/2006/picture">
             <wp:extent cx="5580000" cy="4058182"/>
-            <wp:docPr id="3" name="Picture 3"/>
+            <wp:docPr id="11" name="Picture 11"/>
             <wp:cNvGraphicFramePr>
               <a:graphicFrameLocks noChangeAspect="1"/>
             </wp:cNvGraphicFramePr>
@@ -2117,7 +2672,7 @@
                     <pic:cNvPicPr/>
                   </pic:nvPicPr>
                   <pic:blipFill>
-                    <a:blip r:embed="rId13"/>
+                    <a:blip r:embed="rId21"/>
                     <a:stretch>
                       <a:fillRect/>
                     </a:stretch>
@@ -2152,7 +2707,7 @@
           <w:sz w:val="20"/>
           <w:rFonts w:ascii="Arial" w:hAnsi="Arial" w:eastAsia="SimSun"/>
         </w:rPr>
-        <w:t>图 3 冻结模型在外部独立食管鳞癌队列 (GSE130078 组织 RNA vs PXD063945 质谱参考值) 中的预测分布图</w:t>
+        <w:t>图 11 冻结模型在外部独立食管鳞癌队列 (GSE130078 组织 RNA vs PXD063945 质谱参考值) 中的预测分布图</w:t>
       </w:r>
     </w:p>
     <w:p>
@@ -3752,7 +4307,7 @@
           <w:sz w:val="26"/>
           <w:rFonts w:ascii="Arial" w:hAnsi="Arial" w:eastAsia="SimHei"/>
         </w:rPr>
-        <w:t>五、结果分析与适用边界</w:t>
+        <w:t>六、结果分析与适用边界</w:t>
       </w:r>
     </w:p>
     <w:p>
@@ -3769,7 +4324,7 @@
           <w:sz w:val="23"/>
           <w:rFonts w:ascii="Arial" w:hAnsi="Arial" w:eastAsia="SimHei"/>
         </w:rPr>
-        <w:t>5.1 为什么组学内占比在外部肿瘤中吻合度更好？</w:t>
+        <w:t>6.1 为什么组学内占比在外部肿瘤中吻合度更好？</w:t>
       </w:r>
     </w:p>
     <w:p>
@@ -3802,7 +4357,7 @@
           <w:sz w:val="23"/>
           <w:rFonts w:ascii="Arial" w:hAnsi="Arial" w:eastAsia="SimHei"/>
         </w:rPr>
-        <w:t>5.2 癌旁组织偏离的可能原因与客观限制</w:t>
+        <w:t>6.2 癌旁组织偏离的可能原因与客观限制</w:t>
       </w:r>
     </w:p>
     <w:p>
@@ -3956,7 +4511,7 @@
           <w:sz w:val="23"/>
           <w:rFonts w:ascii="Arial" w:hAnsi="Arial" w:eastAsia="SimHei"/>
         </w:rPr>
-        <w:t>5.3 结论与建议</w:t>
+        <w:t>6.3 总结与后续建议</w:t>
       </w:r>
     </w:p>
     <w:p>
@@ -3989,7 +4544,7 @@
           <w:sz w:val="26"/>
           <w:rFonts w:ascii="Arial" w:hAnsi="Arial" w:eastAsia="SimHei"/>
         </w:rPr>
-        <w:t>六、交付文件与数据索引</w:t>
+        <w:t>七、交付文件与数据索引</w:t>
       </w:r>
     </w:p>
     <w:p>
@@ -4472,6 +5027,346 @@
                 <w:sz w:val="19"/>
                 <w:rFonts w:ascii="Arial" w:hAnsi="Arial" w:eastAsia="SimSun"/>
               </w:rPr>
+              <w:t>Kla-DDR 材料图</w:t>
+            </w:r>
+          </w:p>
+        </w:tc>
+        <w:tc>
+          <w:tcPr>
+            <w:tcW w:type="dxa" w:w="4649"/>
+          </w:tcPr>
+          <w:p>
+            <w:pPr>
+              <w:spacing w:before="50" w:after="50"/>
+              <w:ind w:firstLine="0"/>
+              <w:jc w:val="center"/>
+            </w:pPr>
+            <w:r>
+              <w:rPr>
+                <w:rFonts w:ascii="Arial" w:hAnsi="Arial"/>
+                <w:b w:val="0"/>
+                <w:i w:val="0"/>
+                <w:sz w:val="19"/>
+                <w:rFonts w:ascii="Arial" w:hAnsi="Arial" w:eastAsia="SimSun"/>
+              </w:rPr>
+              <w:t>outputs/20260929_assay_composition/models/Kla_DDR/figures/figure1_material_distributions.png</w:t>
+            </w:r>
+          </w:p>
+        </w:tc>
+        <w:tc>
+          <w:tcPr>
+            <w:tcW w:type="dxa" w:w="2835"/>
+          </w:tcPr>
+          <w:p>
+            <w:pPr>
+              <w:spacing w:before="50" w:after="50"/>
+              <w:ind w:firstLine="0"/>
+              <w:jc w:val="center"/>
+            </w:pPr>
+            <w:r>
+              <w:rPr>
+                <w:rFonts w:ascii="Arial" w:hAnsi="Arial"/>
+                <w:b w:val="0"/>
+                <w:i w:val="0"/>
+                <w:sz w:val="19"/>
+                <w:rFonts w:ascii="Arial" w:hAnsi="Arial" w:eastAsia="SimSun"/>
+              </w:rPr>
+              <w:t>28 种材料预测分布箱线/散点图</w:t>
+            </w:r>
+          </w:p>
+        </w:tc>
+      </w:tr>
+      <w:tr>
+        <w:tc>
+          <w:tcPr>
+            <w:tcW w:type="dxa" w:w="1587"/>
+          </w:tcPr>
+          <w:p>
+            <w:pPr>
+              <w:spacing w:before="50" w:after="50"/>
+              <w:ind w:firstLine="0"/>
+              <w:jc w:val="left"/>
+            </w:pPr>
+            <w:r>
+              <w:rPr>
+                <w:rFonts w:ascii="Arial" w:hAnsi="Arial"/>
+                <w:b w:val="0"/>
+                <w:i w:val="0"/>
+                <w:sz w:val="19"/>
+                <w:rFonts w:ascii="Arial" w:hAnsi="Arial" w:eastAsia="SimSun"/>
+              </w:rPr>
+              <w:t>Kla-DDR 特征图</w:t>
+            </w:r>
+          </w:p>
+        </w:tc>
+        <w:tc>
+          <w:tcPr>
+            <w:tcW w:type="dxa" w:w="4649"/>
+          </w:tcPr>
+          <w:p>
+            <w:pPr>
+              <w:spacing w:before="50" w:after="50"/>
+              <w:ind w:firstLine="0"/>
+              <w:jc w:val="center"/>
+            </w:pPr>
+            <w:r>
+              <w:rPr>
+                <w:rFonts w:ascii="Arial" w:hAnsi="Arial"/>
+                <w:b w:val="0"/>
+                <w:i w:val="0"/>
+                <w:sz w:val="19"/>
+                <w:rFonts w:ascii="Arial" w:hAnsi="Arial" w:eastAsia="SimSun"/>
+              </w:rPr>
+              <w:t>outputs/20260929_assay_composition/models/Kla_DDR/figures/top25.png</w:t>
+            </w:r>
+          </w:p>
+        </w:tc>
+        <w:tc>
+          <w:tcPr>
+            <w:tcW w:type="dxa" w:w="2835"/>
+          </w:tcPr>
+          <w:p>
+            <w:pPr>
+              <w:spacing w:before="50" w:after="50"/>
+              <w:ind w:firstLine="0"/>
+              <w:jc w:val="center"/>
+            </w:pPr>
+            <w:r>
+              <w:rPr>
+                <w:rFonts w:ascii="Arial" w:hAnsi="Arial"/>
+                <w:b w:val="0"/>
+                <w:i w:val="0"/>
+                <w:sz w:val="19"/>
+                <w:rFonts w:ascii="Arial" w:hAnsi="Arial" w:eastAsia="SimSun"/>
+              </w:rPr>
+              <w:t>Top 25 变量重要性条形图 (带 Gene Symbol)</w:t>
+            </w:r>
+          </w:p>
+        </w:tc>
+      </w:tr>
+      <w:tr>
+        <w:tc>
+          <w:tcPr>
+            <w:tcW w:type="dxa" w:w="1587"/>
+          </w:tcPr>
+          <w:p>
+            <w:pPr>
+              <w:spacing w:before="50" w:after="50"/>
+              <w:ind w:firstLine="0"/>
+              <w:jc w:val="left"/>
+            </w:pPr>
+            <w:r>
+              <w:rPr>
+                <w:rFonts w:ascii="Arial" w:hAnsi="Arial"/>
+                <w:b w:val="0"/>
+                <w:i w:val="0"/>
+                <w:sz w:val="19"/>
+                <w:rFonts w:ascii="Arial" w:hAnsi="Arial" w:eastAsia="SimSun"/>
+              </w:rPr>
+              <w:t>Kla-DDR 流形图</w:t>
+            </w:r>
+          </w:p>
+        </w:tc>
+        <w:tc>
+          <w:tcPr>
+            <w:tcW w:type="dxa" w:w="4649"/>
+          </w:tcPr>
+          <w:p>
+            <w:pPr>
+              <w:spacing w:before="50" w:after="50"/>
+              <w:ind w:firstLine="0"/>
+              <w:jc w:val="center"/>
+            </w:pPr>
+            <w:r>
+              <w:rPr>
+                <w:rFonts w:ascii="Arial" w:hAnsi="Arial"/>
+                <w:b w:val="0"/>
+                <w:i w:val="0"/>
+                <w:sz w:val="19"/>
+                <w:rFonts w:ascii="Arial" w:hAnsi="Arial" w:eastAsia="SimSun"/>
+              </w:rPr>
+              <w:t>outputs/20260929_assay_composition/models/Kla_DDR/figures/figure3_manifold_projection.png</w:t>
+            </w:r>
+          </w:p>
+        </w:tc>
+        <w:tc>
+          <w:tcPr>
+            <w:tcW w:type="dxa" w:w="2835"/>
+          </w:tcPr>
+          <w:p>
+            <w:pPr>
+              <w:spacing w:before="50" w:after="50"/>
+              <w:ind w:firstLine="0"/>
+              <w:jc w:val="center"/>
+            </w:pPr>
+            <w:r>
+              <w:rPr>
+                <w:rFonts w:ascii="Arial" w:hAnsi="Arial"/>
+                <w:b w:val="0"/>
+                <w:i w:val="0"/>
+                <w:sz w:val="19"/>
+                <w:rFonts w:ascii="Arial" w:hAnsi="Arial" w:eastAsia="SimSun"/>
+              </w:rPr>
+              <w:t>1,898 样本转录组 UMAP 流形三联色谱图</w:t>
+            </w:r>
+          </w:p>
+        </w:tc>
+      </w:tr>
+      <w:tr>
+        <w:tc>
+          <w:tcPr>
+            <w:tcW w:type="dxa" w:w="1587"/>
+          </w:tcPr>
+          <w:p>
+            <w:pPr>
+              <w:spacing w:before="50" w:after="50"/>
+              <w:ind w:firstLine="0"/>
+              <w:jc w:val="left"/>
+            </w:pPr>
+            <w:r>
+              <w:rPr>
+                <w:rFonts w:ascii="Arial" w:hAnsi="Arial"/>
+                <w:b w:val="0"/>
+                <w:i w:val="0"/>
+                <w:sz w:val="19"/>
+                <w:rFonts w:ascii="Arial" w:hAnsi="Arial" w:eastAsia="SimSun"/>
+              </w:rPr>
+              <w:t>Kla-DDR 残差图</w:t>
+            </w:r>
+          </w:p>
+        </w:tc>
+        <w:tc>
+          <w:tcPr>
+            <w:tcW w:type="dxa" w:w="4649"/>
+          </w:tcPr>
+          <w:p>
+            <w:pPr>
+              <w:spacing w:before="50" w:after="50"/>
+              <w:ind w:firstLine="0"/>
+              <w:jc w:val="center"/>
+            </w:pPr>
+            <w:r>
+              <w:rPr>
+                <w:rFonts w:ascii="Arial" w:hAnsi="Arial"/>
+                <w:b w:val="0"/>
+                <w:i w:val="0"/>
+                <w:sz w:val="19"/>
+                <w:rFonts w:ascii="Arial" w:hAnsi="Arial" w:eastAsia="SimSun"/>
+              </w:rPr>
+              <w:t>outputs/20260929_assay_composition/models/Kla_DDR/figures/figure4_residual_diagnostics.png</w:t>
+            </w:r>
+          </w:p>
+        </w:tc>
+        <w:tc>
+          <w:tcPr>
+            <w:tcW w:type="dxa" w:w="2835"/>
+          </w:tcPr>
+          <w:p>
+            <w:pPr>
+              <w:spacing w:before="50" w:after="50"/>
+              <w:ind w:firstLine="0"/>
+              <w:jc w:val="center"/>
+            </w:pPr>
+            <w:r>
+              <w:rPr>
+                <w:rFonts w:ascii="Arial" w:hAnsi="Arial"/>
+                <w:b w:val="0"/>
+                <w:i w:val="0"/>
+                <w:sz w:val="19"/>
+                <w:rFonts w:ascii="Arial" w:hAnsi="Arial" w:eastAsia="SimSun"/>
+              </w:rPr>
+              <w:t>LOESS 平滑残差与误差密度分布图</w:t>
+            </w:r>
+          </w:p>
+        </w:tc>
+      </w:tr>
+      <w:tr>
+        <w:tc>
+          <w:tcPr>
+            <w:tcW w:type="dxa" w:w="1587"/>
+          </w:tcPr>
+          <w:p>
+            <w:pPr>
+              <w:spacing w:before="50" w:after="50"/>
+              <w:ind w:firstLine="0"/>
+              <w:jc w:val="left"/>
+            </w:pPr>
+            <w:r>
+              <w:rPr>
+                <w:rFonts w:ascii="Arial" w:hAnsi="Arial"/>
+                <w:b w:val="0"/>
+                <w:i w:val="0"/>
+                <w:sz w:val="19"/>
+                <w:rFonts w:ascii="Arial" w:hAnsi="Arial" w:eastAsia="SimSun"/>
+              </w:rPr>
+              <w:t>Kla-DDR 分层图</w:t>
+            </w:r>
+          </w:p>
+        </w:tc>
+        <w:tc>
+          <w:tcPr>
+            <w:tcW w:type="dxa" w:w="4649"/>
+          </w:tcPr>
+          <w:p>
+            <w:pPr>
+              <w:spacing w:before="50" w:after="50"/>
+              <w:ind w:firstLine="0"/>
+              <w:jc w:val="center"/>
+            </w:pPr>
+            <w:r>
+              <w:rPr>
+                <w:rFonts w:ascii="Arial" w:hAnsi="Arial"/>
+                <w:b w:val="0"/>
+                <w:i w:val="0"/>
+                <w:sz w:val="19"/>
+                <w:rFonts w:ascii="Arial" w:hAnsi="Arial" w:eastAsia="SimSun"/>
+              </w:rPr>
+              <w:t>outputs/20260929_assay_composition/models/Kla_DDR/figures/figure5_category_stratified.png</w:t>
+            </w:r>
+          </w:p>
+        </w:tc>
+        <w:tc>
+          <w:tcPr>
+            <w:tcW w:type="dxa" w:w="2835"/>
+          </w:tcPr>
+          <w:p>
+            <w:pPr>
+              <w:spacing w:before="50" w:after="50"/>
+              <w:ind w:firstLine="0"/>
+              <w:jc w:val="center"/>
+            </w:pPr>
+            <w:r>
+              <w:rPr>
+                <w:rFonts w:ascii="Arial" w:hAnsi="Arial"/>
+                <w:b w:val="0"/>
+                <w:i w:val="0"/>
+                <w:sz w:val="19"/>
+                <w:rFonts w:ascii="Arial" w:hAnsi="Arial" w:eastAsia="SimSun"/>
+              </w:rPr>
+              <w:t>四大生物分类分层散点图</w:t>
+            </w:r>
+          </w:p>
+        </w:tc>
+      </w:tr>
+      <w:tr>
+        <w:tc>
+          <w:tcPr>
+            <w:tcW w:type="dxa" w:w="1587"/>
+          </w:tcPr>
+          <w:p>
+            <w:pPr>
+              <w:spacing w:before="50" w:after="50"/>
+              <w:ind w:firstLine="0"/>
+              <w:jc w:val="left"/>
+            </w:pPr>
+            <w:r>
+              <w:rPr>
+                <w:rFonts w:ascii="Arial" w:hAnsi="Arial"/>
+                <w:b w:val="0"/>
+                <w:i w:val="0"/>
+                <w:sz w:val="19"/>
+                <w:rFonts w:ascii="Arial" w:hAnsi="Arial" w:eastAsia="SimSun"/>
+              </w:rPr>
               <w:t>主报告文件</w:t>
             </w:r>
           </w:p>

</xml_diff>